<commit_message>
add data and fix .docx
</commit_message>
<xml_diff>
--- a/BẢNG SO SÁNH.docx
+++ b/BẢNG SO SÁNH.docx
@@ -23,25 +23,28 @@
     <w:tbl>
       <w:tblPr>
         <w:tblStyle w:val="GridTable5Dark-Accent3"/>
-        <w:tblW w:w="0" w:type="auto"/>
+        <w:tblW w:w="11753" w:type="dxa"/>
+        <w:jc w:val="center"/>
         <w:tblLook w:val="04A0" w:firstRow="1" w:lastRow="0" w:firstColumn="1" w:lastColumn="0" w:noHBand="0" w:noVBand="1"/>
       </w:tblPr>
       <w:tblGrid>
-        <w:gridCol w:w="1525"/>
-        <w:gridCol w:w="2071"/>
-        <w:gridCol w:w="1798"/>
-        <w:gridCol w:w="1798"/>
-        <w:gridCol w:w="1799"/>
-        <w:gridCol w:w="1799"/>
+        <w:gridCol w:w="2258"/>
+        <w:gridCol w:w="1524"/>
+        <w:gridCol w:w="1305"/>
+        <w:gridCol w:w="1915"/>
+        <w:gridCol w:w="1337"/>
+        <w:gridCol w:w="1412"/>
+        <w:gridCol w:w="2002"/>
       </w:tblGrid>
       <w:tr>
         <w:trPr>
           <w:cnfStyle w:val="100000000000" w:firstRow="1" w:lastRow="0" w:firstColumn="0" w:lastColumn="0" w:oddVBand="0" w:evenVBand="0" w:oddHBand="0" w:evenHBand="0" w:firstRowFirstColumn="0" w:firstRowLastColumn="0" w:lastRowFirstColumn="0" w:lastRowLastColumn="0"/>
+          <w:jc w:val="center"/>
         </w:trPr>
         <w:tc>
           <w:tcPr>
             <w:cnfStyle w:val="001000000000" w:firstRow="0" w:lastRow="0" w:firstColumn="1" w:lastColumn="0" w:oddVBand="0" w:evenVBand="0" w:oddHBand="0" w:evenHBand="0" w:firstRowFirstColumn="0" w:firstRowLastColumn="0" w:lastRowFirstColumn="0" w:lastRowLastColumn="0"/>
-            <w:tcW w:w="1525" w:type="dxa"/>
+            <w:tcW w:w="2257" w:type="dxa"/>
             <w:vAlign w:val="center"/>
           </w:tcPr>
           <w:p>
@@ -57,13 +60,55 @@
               <w:rPr>
                 <w:rFonts w:ascii="Times New Roman" w:hAnsi="Times New Roman" w:cs="Times New Roman"/>
               </w:rPr>
-              <w:t>Thuật toán / Khái niệm</w:t>
-            </w:r>
-          </w:p>
-        </w:tc>
-        <w:tc>
-          <w:tcPr>
-            <w:tcW w:w="2071" w:type="dxa"/>
+              <w:t>Thuật toán</w:t>
+            </w:r>
+          </w:p>
+        </w:tc>
+        <w:tc>
+          <w:tcPr>
+            <w:tcW w:w="1297" w:type="dxa"/>
+            <w:vAlign w:val="center"/>
+          </w:tcPr>
+          <w:p>
+            <w:pPr>
+              <w:jc w:val="center"/>
+              <w:cnfStyle w:val="100000000000" w:firstRow="1" w:lastRow="0" w:firstColumn="0" w:lastColumn="0" w:oddVBand="0" w:evenVBand="0" w:oddHBand="0" w:evenHBand="0" w:firstRowFirstColumn="0" w:firstRowLastColumn="0" w:lastRowFirstColumn="0" w:lastRowLastColumn="0"/>
+              <w:rPr>
+                <w:rFonts w:ascii="Times New Roman" w:hAnsi="Times New Roman" w:cs="Times New Roman"/>
+              </w:rPr>
+            </w:pPr>
+            <w:r>
+              <w:rPr>
+                <w:rFonts w:ascii="Times New Roman" w:hAnsi="Times New Roman" w:cs="Times New Roman"/>
+              </w:rPr>
+              <w:t>Target</w:t>
+            </w:r>
+          </w:p>
+        </w:tc>
+        <w:tc>
+          <w:tcPr>
+            <w:tcW w:w="1328" w:type="dxa"/>
+            <w:vAlign w:val="center"/>
+          </w:tcPr>
+          <w:p>
+            <w:pPr>
+              <w:jc w:val="center"/>
+              <w:cnfStyle w:val="100000000000" w:firstRow="1" w:lastRow="0" w:firstColumn="0" w:lastColumn="0" w:oddVBand="0" w:evenVBand="0" w:oddHBand="0" w:evenHBand="0" w:firstRowFirstColumn="0" w:firstRowLastColumn="0" w:lastRowFirstColumn="0" w:lastRowLastColumn="0"/>
+              <w:rPr>
+                <w:rFonts w:ascii="Times New Roman" w:hAnsi="Times New Roman" w:cs="Times New Roman"/>
+              </w:rPr>
+            </w:pPr>
+            <w:r>
+              <w:rPr>
+                <w:rFonts w:ascii="Times New Roman" w:hAnsi="Times New Roman" w:cs="Times New Roman"/>
+              </w:rPr>
+              <w:t>Tuyến tính / Phi tuyến</w:t>
+            </w:r>
+          </w:p>
+        </w:tc>
+        <w:tc>
+          <w:tcPr>
+            <w:tcW w:w="1939" w:type="dxa"/>
             <w:vAlign w:val="center"/>
           </w:tcPr>
           <w:p>
@@ -86,7 +131,7 @@
         </w:tc>
         <w:tc>
           <w:tcPr>
-            <w:tcW w:w="1798" w:type="dxa"/>
+            <w:tcW w:w="1374" w:type="dxa"/>
             <w:vAlign w:val="center"/>
           </w:tcPr>
           <w:p>
@@ -103,13 +148,13 @@
               <w:rPr>
                 <w:rFonts w:ascii="Times New Roman" w:hAnsi="Times New Roman" w:cs="Times New Roman"/>
               </w:rPr>
-              <w:t>Hàm dự đoán / Công thức</w:t>
-            </w:r>
-          </w:p>
-        </w:tc>
-        <w:tc>
-          <w:tcPr>
-            <w:tcW w:w="1798" w:type="dxa"/>
+              <w:t>Ưu điểm</w:t>
+            </w:r>
+          </w:p>
+        </w:tc>
+        <w:tc>
+          <w:tcPr>
+            <w:tcW w:w="1450" w:type="dxa"/>
             <w:vAlign w:val="center"/>
           </w:tcPr>
           <w:p>
@@ -126,13 +171,13 @@
               <w:rPr>
                 <w:rFonts w:ascii="Times New Roman" w:hAnsi="Times New Roman" w:cs="Times New Roman"/>
               </w:rPr>
-              <w:t>Ưu điểm</w:t>
-            </w:r>
-          </w:p>
-        </w:tc>
-        <w:tc>
-          <w:tcPr>
-            <w:tcW w:w="1799" w:type="dxa"/>
+              <w:t>Nhược điểm</w:t>
+            </w:r>
+          </w:p>
+        </w:tc>
+        <w:tc>
+          <w:tcPr>
+            <w:tcW w:w="2108" w:type="dxa"/>
             <w:vAlign w:val="center"/>
           </w:tcPr>
           <w:p>
@@ -149,30 +194,7 @@
               <w:rPr>
                 <w:rFonts w:ascii="Times New Roman" w:hAnsi="Times New Roman" w:cs="Times New Roman"/>
               </w:rPr>
-              <w:t>Nhược điểm</w:t>
-            </w:r>
-          </w:p>
-        </w:tc>
-        <w:tc>
-          <w:tcPr>
-            <w:tcW w:w="1799" w:type="dxa"/>
-            <w:vAlign w:val="center"/>
-          </w:tcPr>
-          <w:p>
-            <w:pPr>
-              <w:jc w:val="center"/>
-              <w:cnfStyle w:val="100000000000" w:firstRow="1" w:lastRow="0" w:firstColumn="0" w:lastColumn="0" w:oddVBand="0" w:evenVBand="0" w:oddHBand="0" w:evenHBand="0" w:firstRowFirstColumn="0" w:firstRowLastColumn="0" w:lastRowFirstColumn="0" w:lastRowLastColumn="0"/>
-              <w:rPr>
-                <w:rFonts w:ascii="Times New Roman" w:hAnsi="Times New Roman" w:cs="Times New Roman"/>
-                <w:b w:val="0"/>
-                <w:bCs w:val="0"/>
-              </w:rPr>
-            </w:pPr>
-            <w:r>
-              <w:rPr>
-                <w:rFonts w:ascii="Times New Roman" w:hAnsi="Times New Roman" w:cs="Times New Roman"/>
-              </w:rPr>
-              <w:t>Ứng dụng điển hình</w:t>
+              <w:t>Ứng dụng</w:t>
             </w:r>
           </w:p>
         </w:tc>
@@ -180,11 +202,12 @@
       <w:tr>
         <w:trPr>
           <w:cnfStyle w:val="000000100000" w:firstRow="0" w:lastRow="0" w:firstColumn="0" w:lastColumn="0" w:oddVBand="0" w:evenVBand="0" w:oddHBand="1" w:evenHBand="0" w:firstRowFirstColumn="0" w:firstRowLastColumn="0" w:lastRowFirstColumn="0" w:lastRowLastColumn="0"/>
+          <w:jc w:val="center"/>
         </w:trPr>
         <w:tc>
           <w:tcPr>
             <w:cnfStyle w:val="001000000000" w:firstRow="0" w:lastRow="0" w:firstColumn="1" w:lastColumn="0" w:oddVBand="0" w:evenVBand="0" w:oddHBand="0" w:evenHBand="0" w:firstRowFirstColumn="0" w:firstRowLastColumn="0" w:lastRowFirstColumn="0" w:lastRowLastColumn="0"/>
-            <w:tcW w:w="1525" w:type="dxa"/>
+            <w:tcW w:w="2257" w:type="dxa"/>
             <w:vAlign w:val="center"/>
           </w:tcPr>
           <w:p>
@@ -206,7 +229,7 @@
         </w:tc>
         <w:tc>
           <w:tcPr>
-            <w:tcW w:w="2071" w:type="dxa"/>
+            <w:tcW w:w="1297" w:type="dxa"/>
             <w:vAlign w:val="center"/>
           </w:tcPr>
           <w:p>
@@ -221,13 +244,13 @@
               <w:rPr>
                 <w:rFonts w:ascii="Times New Roman" w:hAnsi="Times New Roman" w:cs="Times New Roman"/>
               </w:rPr>
-              <w:t>Tìm đường (siêu phẳng) khớp tốt nhất dữ liệu</w:t>
-            </w:r>
-          </w:p>
-        </w:tc>
-        <w:tc>
-          <w:tcPr>
-            <w:tcW w:w="1798" w:type="dxa"/>
+              <w:t>Regression</w:t>
+            </w:r>
+          </w:p>
+        </w:tc>
+        <w:tc>
+          <w:tcPr>
+            <w:tcW w:w="1328" w:type="dxa"/>
             <w:vAlign w:val="center"/>
           </w:tcPr>
           <w:p>
@@ -238,57 +261,17 @@
                 <w:rFonts w:ascii="Times New Roman" w:hAnsi="Times New Roman" w:cs="Times New Roman"/>
               </w:rPr>
             </w:pPr>
-            <m:oMath>
-              <m:r>
-                <w:rPr>
-                  <w:rFonts w:ascii="Cambria Math" w:hAnsi="Cambria Math" w:cs="Times New Roman"/>
-                </w:rPr>
-                <m:t>y=</m:t>
-              </m:r>
-              <m:sSup>
-                <m:sSupPr>
-                  <m:ctrlPr>
-                    <w:rPr>
-                      <w:rFonts w:ascii="Cambria Math" w:hAnsi="Cambria Math" w:cs="Times New Roman"/>
-                      <w:i/>
-                    </w:rPr>
-                  </m:ctrlPr>
-                </m:sSupPr>
-                <m:e>
-                  <m:r>
-                    <w:rPr>
-                      <w:rFonts w:ascii="Cambria Math" w:hAnsi="Cambria Math" w:cs="Times New Roman"/>
-                    </w:rPr>
-                    <m:t>ω</m:t>
-                  </m:r>
-                </m:e>
-                <m:sup>
-                  <m:r>
-                    <w:rPr>
-                      <w:rFonts w:ascii="Cambria Math" w:hAnsi="Cambria Math" w:cs="Times New Roman"/>
-                    </w:rPr>
-                    <m:t>T</m:t>
-                  </m:r>
-                </m:sup>
-              </m:sSup>
-              <m:r>
-                <w:rPr>
-                  <w:rFonts w:ascii="Cambria Math" w:hAnsi="Cambria Math" w:cs="Times New Roman"/>
-                </w:rPr>
-                <m:t>x+b</m:t>
-              </m:r>
-            </m:oMath>
-            <w:r>
-              <w:rPr>
-                <w:rFonts w:ascii="Times New Roman" w:eastAsiaTheme="minorEastAsia" w:hAnsi="Times New Roman" w:cs="Times New Roman"/>
-              </w:rPr>
-              <w:t xml:space="preserve"> – ước lượng bằng Least Squares</w:t>
-            </w:r>
-          </w:p>
-        </w:tc>
-        <w:tc>
-          <w:tcPr>
-            <w:tcW w:w="1798" w:type="dxa"/>
+            <w:r>
+              <w:rPr>
+                <w:rFonts w:ascii="Times New Roman" w:hAnsi="Times New Roman" w:cs="Times New Roman"/>
+              </w:rPr>
+              <w:t>Tuyến tính</w:t>
+            </w:r>
+          </w:p>
+        </w:tc>
+        <w:tc>
+          <w:tcPr>
+            <w:tcW w:w="1939" w:type="dxa"/>
             <w:vAlign w:val="center"/>
           </w:tcPr>
           <w:p>
@@ -303,13 +286,13 @@
               <w:rPr>
                 <w:rFonts w:ascii="Times New Roman" w:hAnsi="Times New Roman" w:cs="Times New Roman"/>
               </w:rPr>
-              <w:t>Đơn giản, dễ hiểu, nhanh</w:t>
-            </w:r>
-          </w:p>
-        </w:tc>
-        <w:tc>
-          <w:tcPr>
-            <w:tcW w:w="1799" w:type="dxa"/>
+              <w:t>Fit đường thẳng tối ưu</w:t>
+            </w:r>
+          </w:p>
+        </w:tc>
+        <w:tc>
+          <w:tcPr>
+            <w:tcW w:w="1374" w:type="dxa"/>
             <w:vAlign w:val="center"/>
           </w:tcPr>
           <w:p>
@@ -324,13 +307,13 @@
               <w:rPr>
                 <w:rFonts w:ascii="Times New Roman" w:hAnsi="Times New Roman" w:cs="Times New Roman"/>
               </w:rPr>
-              <w:t>Nhạy cảm với outlier, chỉ mô hình hóa tuyến tính</w:t>
-            </w:r>
-          </w:p>
-        </w:tc>
-        <w:tc>
-          <w:tcPr>
-            <w:tcW w:w="1799" w:type="dxa"/>
+              <w:t>Đơn giản, dễ giải thích</w:t>
+            </w:r>
+          </w:p>
+        </w:tc>
+        <w:tc>
+          <w:tcPr>
+            <w:tcW w:w="1450" w:type="dxa"/>
             <w:vAlign w:val="center"/>
           </w:tcPr>
           <w:p>
@@ -345,50 +328,60 @@
               <w:rPr>
                 <w:rFonts w:ascii="Times New Roman" w:hAnsi="Times New Roman" w:cs="Times New Roman"/>
               </w:rPr>
-              <w:t>Dự đoán giá nhà, xu hướng kinh tế</w:t>
+              <w:t>Không mô hình hóa phi tuyến, nhạy outlier</w:t>
+            </w:r>
+          </w:p>
+        </w:tc>
+        <w:tc>
+          <w:tcPr>
+            <w:tcW w:w="2108" w:type="dxa"/>
+            <w:vAlign w:val="center"/>
+          </w:tcPr>
+          <w:p>
+            <w:pPr>
+              <w:jc w:val="center"/>
+              <w:cnfStyle w:val="000000100000" w:firstRow="0" w:lastRow="0" w:firstColumn="0" w:lastColumn="0" w:oddVBand="0" w:evenVBand="0" w:oddHBand="1" w:evenHBand="0" w:firstRowFirstColumn="0" w:firstRowLastColumn="0" w:lastRowFirstColumn="0" w:lastRowLastColumn="0"/>
+              <w:rPr>
+                <w:rFonts w:ascii="Times New Roman" w:hAnsi="Times New Roman" w:cs="Times New Roman"/>
+              </w:rPr>
+            </w:pPr>
+            <w:r>
+              <w:rPr>
+                <w:rFonts w:ascii="Times New Roman" w:hAnsi="Times New Roman" w:cs="Times New Roman"/>
+              </w:rPr>
+              <w:t>Giá nhà, xu hướng</w:t>
             </w:r>
           </w:p>
         </w:tc>
       </w:tr>
       <w:tr>
+        <w:trPr>
+          <w:jc w:val="center"/>
+        </w:trPr>
         <w:tc>
           <w:tcPr>
             <w:cnfStyle w:val="001000000000" w:firstRow="0" w:lastRow="0" w:firstColumn="1" w:lastColumn="0" w:oddVBand="0" w:evenVBand="0" w:oddHBand="0" w:evenHBand="0" w:firstRowFirstColumn="0" w:firstRowLastColumn="0" w:lastRowFirstColumn="0" w:lastRowLastColumn="0"/>
-            <w:tcW w:w="1525" w:type="dxa"/>
-            <w:vAlign w:val="center"/>
-          </w:tcPr>
-          <w:p>
-            <w:pPr>
-              <w:jc w:val="center"/>
-              <w:rPr>
-                <w:rFonts w:ascii="Times New Roman" w:hAnsi="Times New Roman" w:cs="Times New Roman"/>
-                <w:b w:val="0"/>
-                <w:bCs w:val="0"/>
-              </w:rPr>
-            </w:pPr>
-            <w:r>
-              <w:rPr>
-                <w:rFonts w:ascii="Times New Roman" w:hAnsi="Times New Roman" w:cs="Times New Roman"/>
-              </w:rPr>
-              <w:t>Logi</w:t>
-            </w:r>
-            <w:r>
-              <w:rPr>
-                <w:rFonts w:ascii="Times New Roman" w:hAnsi="Times New Roman" w:cs="Times New Roman"/>
-              </w:rPr>
-              <w:t>s</w:t>
-            </w:r>
-            <w:r>
-              <w:rPr>
-                <w:rFonts w:ascii="Times New Roman" w:hAnsi="Times New Roman" w:cs="Times New Roman"/>
-              </w:rPr>
-              <w:t>tic Regresssion</w:t>
-            </w:r>
-          </w:p>
-        </w:tc>
-        <w:tc>
-          <w:tcPr>
-            <w:tcW w:w="2071" w:type="dxa"/>
+            <w:tcW w:w="2257" w:type="dxa"/>
+            <w:vAlign w:val="center"/>
+          </w:tcPr>
+          <w:p>
+            <w:pPr>
+              <w:jc w:val="center"/>
+              <w:rPr>
+                <w:rFonts w:ascii="Times New Roman" w:hAnsi="Times New Roman" w:cs="Times New Roman"/>
+              </w:rPr>
+            </w:pPr>
+            <w:r>
+              <w:rPr>
+                <w:rFonts w:ascii="Times New Roman" w:hAnsi="Times New Roman" w:cs="Times New Roman"/>
+              </w:rPr>
+              <w:t>Rigde</w:t>
+            </w:r>
+          </w:p>
+        </w:tc>
+        <w:tc>
+          <w:tcPr>
+            <w:tcW w:w="1297" w:type="dxa"/>
             <w:vAlign w:val="center"/>
           </w:tcPr>
           <w:p>
@@ -403,13 +396,13 @@
               <w:rPr>
                 <w:rFonts w:ascii="Times New Roman" w:hAnsi="Times New Roman" w:cs="Times New Roman"/>
               </w:rPr>
-              <w:t>Sử dụng sigmoid để phân loại xác xuất nhị phân</w:t>
-            </w:r>
-          </w:p>
-        </w:tc>
-        <w:tc>
-          <w:tcPr>
-            <w:tcW w:w="1798" w:type="dxa"/>
+              <w:t>Regression</w:t>
+            </w:r>
+          </w:p>
+        </w:tc>
+        <w:tc>
+          <w:tcPr>
+            <w:tcW w:w="1328" w:type="dxa"/>
             <w:vAlign w:val="center"/>
           </w:tcPr>
           <w:p>
@@ -420,141 +413,17 @@
                 <w:rFonts w:ascii="Times New Roman" w:hAnsi="Times New Roman" w:cs="Times New Roman"/>
               </w:rPr>
             </w:pPr>
-            <m:oMathPara>
-              <m:oMath>
-                <m:sSub>
-                  <m:sSubPr>
-                    <m:ctrlPr>
-                      <w:rPr>
-                        <w:rFonts w:ascii="Cambria Math" w:hAnsi="Cambria Math" w:cs="Times New Roman"/>
-                        <w:i/>
-                      </w:rPr>
-                    </m:ctrlPr>
-                  </m:sSubPr>
-                  <m:e>
-                    <m:r>
-                      <w:rPr>
-                        <w:rFonts w:ascii="Cambria Math" w:hAnsi="Cambria Math" w:cs="Times New Roman"/>
-                      </w:rPr>
-                      <m:t>h</m:t>
-                    </m:r>
-                  </m:e>
-                  <m:sub>
-                    <m:r>
-                      <w:rPr>
-                        <w:rFonts w:ascii="Cambria Math" w:hAnsi="Cambria Math" w:cs="Times New Roman"/>
-                      </w:rPr>
-                      <m:t>θ</m:t>
-                    </m:r>
-                  </m:sub>
-                </m:sSub>
-                <m:d>
-                  <m:dPr>
-                    <m:ctrlPr>
-                      <w:rPr>
-                        <w:rFonts w:ascii="Cambria Math" w:hAnsi="Cambria Math" w:cs="Times New Roman"/>
-                        <w:i/>
-                      </w:rPr>
-                    </m:ctrlPr>
-                  </m:dPr>
-                  <m:e>
-                    <m:r>
-                      <w:rPr>
-                        <w:rFonts w:ascii="Cambria Math" w:hAnsi="Cambria Math" w:cs="Times New Roman"/>
-                      </w:rPr>
-                      <m:t>x</m:t>
-                    </m:r>
-                  </m:e>
-                </m:d>
-                <m:r>
-                  <w:rPr>
-                    <w:rFonts w:ascii="Cambria Math" w:hAnsi="Cambria Math" w:cs="Times New Roman"/>
-                  </w:rPr>
-                  <m:t>=σ</m:t>
-                </m:r>
-                <m:d>
-                  <m:dPr>
-                    <m:ctrlPr>
-                      <w:rPr>
-                        <w:rFonts w:ascii="Cambria Math" w:hAnsi="Cambria Math" w:cs="Times New Roman"/>
-                        <w:i/>
-                      </w:rPr>
-                    </m:ctrlPr>
-                  </m:dPr>
-                  <m:e>
-                    <m:r>
-                      <w:rPr>
-                        <w:rFonts w:ascii="Cambria Math" w:hAnsi="Cambria Math" w:cs="Times New Roman"/>
-                      </w:rPr>
-                      <m:t>z</m:t>
-                    </m:r>
-                  </m:e>
-                </m:d>
-                <m:r>
-                  <w:rPr>
-                    <w:rFonts w:ascii="Cambria Math" w:hAnsi="Cambria Math" w:cs="Times New Roman"/>
-                  </w:rPr>
-                  <m:t>=</m:t>
-                </m:r>
-                <m:f>
-                  <m:fPr>
-                    <m:ctrlPr>
-                      <w:rPr>
-                        <w:rFonts w:ascii="Cambria Math" w:hAnsi="Cambria Math" w:cs="Times New Roman"/>
-                        <w:i/>
-                      </w:rPr>
-                    </m:ctrlPr>
-                  </m:fPr>
-                  <m:num>
-                    <m:r>
-                      <w:rPr>
-                        <w:rFonts w:ascii="Cambria Math" w:hAnsi="Cambria Math" w:cs="Times New Roman"/>
-                      </w:rPr>
-                      <m:t>1</m:t>
-                    </m:r>
-                  </m:num>
-                  <m:den>
-                    <m:r>
-                      <w:rPr>
-                        <w:rFonts w:ascii="Cambria Math" w:hAnsi="Cambria Math" w:cs="Times New Roman"/>
-                      </w:rPr>
-                      <m:t>1+</m:t>
-                    </m:r>
-                    <m:sSup>
-                      <m:sSupPr>
-                        <m:ctrlPr>
-                          <w:rPr>
-                            <w:rFonts w:ascii="Cambria Math" w:hAnsi="Cambria Math" w:cs="Times New Roman"/>
-                            <w:i/>
-                          </w:rPr>
-                        </m:ctrlPr>
-                      </m:sSupPr>
-                      <m:e>
-                        <m:r>
-                          <w:rPr>
-                            <w:rFonts w:ascii="Cambria Math" w:hAnsi="Cambria Math" w:cs="Times New Roman"/>
-                          </w:rPr>
-                          <m:t>e</m:t>
-                        </m:r>
-                      </m:e>
-                      <m:sup>
-                        <m:r>
-                          <w:rPr>
-                            <w:rFonts w:ascii="Cambria Math" w:hAnsi="Cambria Math" w:cs="Times New Roman"/>
-                          </w:rPr>
-                          <m:t>-z</m:t>
-                        </m:r>
-                      </m:sup>
-                    </m:sSup>
-                  </m:den>
-                </m:f>
-              </m:oMath>
-            </m:oMathPara>
-          </w:p>
-        </w:tc>
-        <w:tc>
-          <w:tcPr>
-            <w:tcW w:w="1798" w:type="dxa"/>
+            <w:r>
+              <w:rPr>
+                <w:rFonts w:ascii="Times New Roman" w:hAnsi="Times New Roman" w:cs="Times New Roman"/>
+              </w:rPr>
+              <w:t>Tuyến tính</w:t>
+            </w:r>
+          </w:p>
+        </w:tc>
+        <w:tc>
+          <w:tcPr>
+            <w:tcW w:w="1939" w:type="dxa"/>
             <w:vAlign w:val="center"/>
           </w:tcPr>
           <w:p>
@@ -569,25 +438,13 @@
               <w:rPr>
                 <w:rFonts w:ascii="Times New Roman" w:hAnsi="Times New Roman" w:cs="Times New Roman"/>
               </w:rPr>
-              <w:t xml:space="preserve">Giải thích rõ ràng, dùng cho xác </w:t>
-            </w:r>
-            <w:r>
-              <w:rPr>
-                <w:rFonts w:ascii="Times New Roman" w:hAnsi="Times New Roman" w:cs="Times New Roman"/>
-              </w:rPr>
-              <w:t>s</w:t>
-            </w:r>
-            <w:r>
-              <w:rPr>
-                <w:rFonts w:ascii="Times New Roman" w:hAnsi="Times New Roman" w:cs="Times New Roman"/>
-              </w:rPr>
-              <w:t>uất</w:t>
-            </w:r>
-          </w:p>
-        </w:tc>
-        <w:tc>
-          <w:tcPr>
-            <w:tcW w:w="1799" w:type="dxa"/>
+              <w:t>Linear Regression + L2 penalty</w:t>
+            </w:r>
+          </w:p>
+        </w:tc>
+        <w:tc>
+          <w:tcPr>
+            <w:tcW w:w="1374" w:type="dxa"/>
             <w:vAlign w:val="center"/>
           </w:tcPr>
           <w:p>
@@ -602,13 +459,13 @@
               <w:rPr>
                 <w:rFonts w:ascii="Times New Roman" w:hAnsi="Times New Roman" w:cs="Times New Roman"/>
               </w:rPr>
-              <w:t>Chỉ phân loại cho tuyến tính, khó cho dữ liệu phi tuyến</w:t>
-            </w:r>
-          </w:p>
-        </w:tc>
-        <w:tc>
-          <w:tcPr>
-            <w:tcW w:w="1799" w:type="dxa"/>
+              <w:t>Giảm overfit, ổn định</w:t>
+            </w:r>
+          </w:p>
+        </w:tc>
+        <w:tc>
+          <w:tcPr>
+            <w:tcW w:w="1450" w:type="dxa"/>
             <w:vAlign w:val="center"/>
           </w:tcPr>
           <w:p>
@@ -623,7 +480,28 @@
               <w:rPr>
                 <w:rFonts w:ascii="Times New Roman" w:hAnsi="Times New Roman" w:cs="Times New Roman"/>
               </w:rPr>
-              <w:t>Ước tính xác suất xảy ra một sự kiện với kết quả nhị phân (có/không, 0/1, đúng/ sai)</w:t>
+              <w:t>Không chọn lọc feature, kém nếu phi tuyến</w:t>
+            </w:r>
+          </w:p>
+        </w:tc>
+        <w:tc>
+          <w:tcPr>
+            <w:tcW w:w="2108" w:type="dxa"/>
+            <w:vAlign w:val="center"/>
+          </w:tcPr>
+          <w:p>
+            <w:pPr>
+              <w:jc w:val="center"/>
+              <w:cnfStyle w:val="000000000000" w:firstRow="0" w:lastRow="0" w:firstColumn="0" w:lastColumn="0" w:oddVBand="0" w:evenVBand="0" w:oddHBand="0" w:evenHBand="0" w:firstRowFirstColumn="0" w:firstRowLastColumn="0" w:lastRowFirstColumn="0" w:lastRowLastColumn="0"/>
+              <w:rPr>
+                <w:rFonts w:ascii="Times New Roman" w:hAnsi="Times New Roman" w:cs="Times New Roman"/>
+              </w:rPr>
+            </w:pPr>
+            <w:r>
+              <w:rPr>
+                <w:rFonts w:ascii="Times New Roman" w:hAnsi="Times New Roman" w:cs="Times New Roman"/>
+              </w:rPr>
+              <w:t>Dự đoán giá có nhiều feature</w:t>
             </w:r>
           </w:p>
         </w:tc>
@@ -631,11 +509,193 @@
       <w:tr>
         <w:trPr>
           <w:cnfStyle w:val="000000100000" w:firstRow="0" w:lastRow="0" w:firstColumn="0" w:lastColumn="0" w:oddVBand="0" w:evenVBand="0" w:oddHBand="1" w:evenHBand="0" w:firstRowFirstColumn="0" w:firstRowLastColumn="0" w:lastRowFirstColumn="0" w:lastRowLastColumn="0"/>
+          <w:jc w:val="center"/>
         </w:trPr>
         <w:tc>
           <w:tcPr>
             <w:cnfStyle w:val="001000000000" w:firstRow="0" w:lastRow="0" w:firstColumn="1" w:lastColumn="0" w:oddVBand="0" w:evenVBand="0" w:oddHBand="0" w:evenHBand="0" w:firstRowFirstColumn="0" w:firstRowLastColumn="0" w:lastRowFirstColumn="0" w:lastRowLastColumn="0"/>
-            <w:tcW w:w="1525" w:type="dxa"/>
+            <w:tcW w:w="2257" w:type="dxa"/>
+            <w:vAlign w:val="center"/>
+          </w:tcPr>
+          <w:p>
+            <w:pPr>
+              <w:jc w:val="center"/>
+              <w:rPr>
+                <w:rFonts w:ascii="Times New Roman" w:hAnsi="Times New Roman" w:cs="Times New Roman"/>
+              </w:rPr>
+            </w:pPr>
+            <w:r>
+              <w:rPr>
+                <w:rFonts w:ascii="Times New Roman" w:hAnsi="Times New Roman" w:cs="Times New Roman"/>
+              </w:rPr>
+              <w:t>Lasso</w:t>
+            </w:r>
+          </w:p>
+        </w:tc>
+        <w:tc>
+          <w:tcPr>
+            <w:tcW w:w="1297" w:type="dxa"/>
+            <w:vAlign w:val="center"/>
+          </w:tcPr>
+          <w:p>
+            <w:pPr>
+              <w:jc w:val="center"/>
+              <w:cnfStyle w:val="000000100000" w:firstRow="0" w:lastRow="0" w:firstColumn="0" w:lastColumn="0" w:oddVBand="0" w:evenVBand="0" w:oddHBand="1" w:evenHBand="0" w:firstRowFirstColumn="0" w:firstRowLastColumn="0" w:lastRowFirstColumn="0" w:lastRowLastColumn="0"/>
+              <w:rPr>
+                <w:rFonts w:ascii="Times New Roman" w:hAnsi="Times New Roman" w:cs="Times New Roman"/>
+              </w:rPr>
+            </w:pPr>
+            <w:r>
+              <w:rPr>
+                <w:rFonts w:ascii="Times New Roman" w:hAnsi="Times New Roman" w:cs="Times New Roman"/>
+              </w:rPr>
+              <w:t>Regression</w:t>
+            </w:r>
+          </w:p>
+        </w:tc>
+        <w:tc>
+          <w:tcPr>
+            <w:tcW w:w="1328" w:type="dxa"/>
+            <w:vAlign w:val="center"/>
+          </w:tcPr>
+          <w:p>
+            <w:pPr>
+              <w:jc w:val="center"/>
+              <w:cnfStyle w:val="000000100000" w:firstRow="0" w:lastRow="0" w:firstColumn="0" w:lastColumn="0" w:oddVBand="0" w:evenVBand="0" w:oddHBand="1" w:evenHBand="0" w:firstRowFirstColumn="0" w:firstRowLastColumn="0" w:lastRowFirstColumn="0" w:lastRowLastColumn="0"/>
+              <w:rPr>
+                <w:rFonts w:ascii="Times New Roman" w:hAnsi="Times New Roman" w:cs="Times New Roman"/>
+              </w:rPr>
+            </w:pPr>
+            <w:r>
+              <w:rPr>
+                <w:rFonts w:ascii="Times New Roman" w:hAnsi="Times New Roman" w:cs="Times New Roman"/>
+              </w:rPr>
+              <w:t>Tuyến tính</w:t>
+            </w:r>
+          </w:p>
+        </w:tc>
+        <w:tc>
+          <w:tcPr>
+            <w:tcW w:w="1939" w:type="dxa"/>
+            <w:vAlign w:val="center"/>
+          </w:tcPr>
+          <w:p>
+            <w:pPr>
+              <w:jc w:val="center"/>
+              <w:cnfStyle w:val="000000100000" w:firstRow="0" w:lastRow="0" w:firstColumn="0" w:lastColumn="0" w:oddVBand="0" w:evenVBand="0" w:oddHBand="1" w:evenHBand="0" w:firstRowFirstColumn="0" w:firstRowLastColumn="0" w:lastRowFirstColumn="0" w:lastRowLastColumn="0"/>
+              <w:rPr>
+                <w:rFonts w:ascii="Times New Roman" w:hAnsi="Times New Roman" w:cs="Times New Roman"/>
+              </w:rPr>
+            </w:pPr>
+            <w:r>
+              <w:rPr>
+                <w:rFonts w:ascii="Times New Roman" w:hAnsi="Times New Roman" w:cs="Times New Roman"/>
+              </w:rPr>
+              <w:t>Linear Regression + L</w:t>
+            </w:r>
+            <w:r>
+              <w:rPr>
+                <w:rFonts w:ascii="Times New Roman" w:hAnsi="Times New Roman" w:cs="Times New Roman"/>
+              </w:rPr>
+              <w:t>1</w:t>
+            </w:r>
+            <w:r>
+              <w:rPr>
+                <w:rFonts w:ascii="Times New Roman" w:hAnsi="Times New Roman" w:cs="Times New Roman"/>
+              </w:rPr>
+              <w:t xml:space="preserve"> penalty</w:t>
+            </w:r>
+          </w:p>
+        </w:tc>
+        <w:tc>
+          <w:tcPr>
+            <w:tcW w:w="1374" w:type="dxa"/>
+            <w:vAlign w:val="center"/>
+          </w:tcPr>
+          <w:p>
+            <w:pPr>
+              <w:jc w:val="center"/>
+              <w:cnfStyle w:val="000000100000" w:firstRow="0" w:lastRow="0" w:firstColumn="0" w:lastColumn="0" w:oddVBand="0" w:evenVBand="0" w:oddHBand="1" w:evenHBand="0" w:firstRowFirstColumn="0" w:firstRowLastColumn="0" w:lastRowFirstColumn="0" w:lastRowLastColumn="0"/>
+              <w:rPr>
+                <w:rFonts w:ascii="Times New Roman" w:hAnsi="Times New Roman" w:cs="Times New Roman"/>
+              </w:rPr>
+            </w:pPr>
+            <w:r>
+              <w:rPr>
+                <w:rFonts w:ascii="Times New Roman" w:hAnsi="Times New Roman" w:cs="Times New Roman"/>
+              </w:rPr>
+              <w:t>Feature selection tự động</w:t>
+            </w:r>
+          </w:p>
+        </w:tc>
+        <w:tc>
+          <w:tcPr>
+            <w:tcW w:w="1450" w:type="dxa"/>
+            <w:vAlign w:val="center"/>
+          </w:tcPr>
+          <w:p>
+            <w:pPr>
+              <w:jc w:val="center"/>
+              <w:cnfStyle w:val="000000100000" w:firstRow="0" w:lastRow="0" w:firstColumn="0" w:lastColumn="0" w:oddVBand="0" w:evenVBand="0" w:oddHBand="1" w:evenHBand="0" w:firstRowFirstColumn="0" w:firstRowLastColumn="0" w:lastRowFirstColumn="0" w:lastRowLastColumn="0"/>
+              <w:rPr>
+                <w:rFonts w:ascii="Times New Roman" w:hAnsi="Times New Roman" w:cs="Times New Roman"/>
+              </w:rPr>
+            </w:pPr>
+            <w:r>
+              <w:rPr>
+                <w:rFonts w:ascii="Times New Roman" w:hAnsi="Times New Roman" w:cs="Times New Roman"/>
+              </w:rPr>
+              <w:t xml:space="preserve">Có thể loại bỏ feature quan trọng nếu </w:t>
+            </w:r>
+            <m:oMath>
+              <m:r>
+                <m:rPr>
+                  <m:sty m:val="p"/>
+                </m:rPr>
+                <w:rPr>
+                  <w:rFonts w:ascii="Cambria Math" w:hAnsi="Cambria Math"/>
+                </w:rPr>
+                <m:t>λ</m:t>
+              </m:r>
+            </m:oMath>
+            <w:r>
+              <w:rPr>
+                <w:rFonts w:ascii="Times New Roman" w:eastAsiaTheme="minorEastAsia" w:hAnsi="Times New Roman" w:cs="Times New Roman"/>
+              </w:rPr>
+              <w:t xml:space="preserve"> lớn</w:t>
+            </w:r>
+          </w:p>
+        </w:tc>
+        <w:tc>
+          <w:tcPr>
+            <w:tcW w:w="2108" w:type="dxa"/>
+            <w:vAlign w:val="center"/>
+          </w:tcPr>
+          <w:p>
+            <w:pPr>
+              <w:jc w:val="center"/>
+              <w:cnfStyle w:val="000000100000" w:firstRow="0" w:lastRow="0" w:firstColumn="0" w:lastColumn="0" w:oddVBand="0" w:evenVBand="0" w:oddHBand="1" w:evenHBand="0" w:firstRowFirstColumn="0" w:firstRowLastColumn="0" w:lastRowFirstColumn="0" w:lastRowLastColumn="0"/>
+              <w:rPr>
+                <w:rFonts w:ascii="Times New Roman" w:hAnsi="Times New Roman" w:cs="Times New Roman"/>
+              </w:rPr>
+            </w:pPr>
+            <w:r>
+              <w:rPr>
+                <w:rFonts w:ascii="Times New Roman" w:hAnsi="Times New Roman" w:cs="Times New Roman"/>
+              </w:rPr>
+              <w:t>Mô hình spare</w:t>
+            </w:r>
+          </w:p>
+        </w:tc>
+      </w:tr>
+      <w:tr>
+        <w:trPr>
+          <w:jc w:val="center"/>
+        </w:trPr>
+        <w:tc>
+          <w:tcPr>
+            <w:cnfStyle w:val="001000000000" w:firstRow="0" w:lastRow="0" w:firstColumn="1" w:lastColumn="0" w:oddVBand="0" w:evenVBand="0" w:oddHBand="0" w:evenHBand="0" w:firstRowFirstColumn="0" w:firstRowLastColumn="0" w:lastRowFirstColumn="0" w:lastRowLastColumn="0"/>
+            <w:tcW w:w="2257" w:type="dxa"/>
             <w:vAlign w:val="center"/>
           </w:tcPr>
           <w:p>
@@ -651,143 +711,13 @@
               <w:rPr>
                 <w:rFonts w:ascii="Times New Roman" w:hAnsi="Times New Roman" w:cs="Times New Roman"/>
               </w:rPr>
-              <w:t>KNN</w:t>
-            </w:r>
-          </w:p>
-        </w:tc>
-        <w:tc>
-          <w:tcPr>
-            <w:tcW w:w="2071" w:type="dxa"/>
-            <w:vAlign w:val="center"/>
-          </w:tcPr>
-          <w:p>
-            <w:pPr>
-              <w:jc w:val="center"/>
-              <w:cnfStyle w:val="000000100000" w:firstRow="0" w:lastRow="0" w:firstColumn="0" w:lastColumn="0" w:oddVBand="0" w:evenVBand="0" w:oddHBand="1" w:evenHBand="0" w:firstRowFirstColumn="0" w:firstRowLastColumn="0" w:lastRowFirstColumn="0" w:lastRowLastColumn="0"/>
-              <w:rPr>
-                <w:rFonts w:ascii="Times New Roman" w:hAnsi="Times New Roman" w:cs="Times New Roman"/>
-              </w:rPr>
-            </w:pPr>
-            <w:r>
-              <w:rPr>
-                <w:rFonts w:ascii="Times New Roman" w:hAnsi="Times New Roman" w:cs="Times New Roman"/>
-              </w:rPr>
-              <w:t>Dự đoán trên k láng giềng gần nhất</w:t>
-            </w:r>
-          </w:p>
-        </w:tc>
-        <w:tc>
-          <w:tcPr>
-            <w:tcW w:w="1798" w:type="dxa"/>
-            <w:vAlign w:val="center"/>
-          </w:tcPr>
-          <w:p>
-            <w:pPr>
-              <w:jc w:val="center"/>
-              <w:cnfStyle w:val="000000100000" w:firstRow="0" w:lastRow="0" w:firstColumn="0" w:lastColumn="0" w:oddVBand="0" w:evenVBand="0" w:oddHBand="1" w:evenHBand="0" w:firstRowFirstColumn="0" w:firstRowLastColumn="0" w:lastRowFirstColumn="0" w:lastRowLastColumn="0"/>
-              <w:rPr>
-                <w:rFonts w:ascii="Times New Roman" w:hAnsi="Times New Roman" w:cs="Times New Roman"/>
-              </w:rPr>
-            </w:pPr>
-            <w:r>
-              <w:rPr>
-                <w:rFonts w:ascii="Times New Roman" w:hAnsi="Times New Roman" w:cs="Times New Roman"/>
-              </w:rPr>
-              <w:t>Không có hàm học tham số, chỉ tính khoảng cách (Euclidean, v.v)</w:t>
-            </w:r>
-          </w:p>
-        </w:tc>
-        <w:tc>
-          <w:tcPr>
-            <w:tcW w:w="1798" w:type="dxa"/>
-            <w:vAlign w:val="center"/>
-          </w:tcPr>
-          <w:p>
-            <w:pPr>
-              <w:jc w:val="center"/>
-              <w:cnfStyle w:val="000000100000" w:firstRow="0" w:lastRow="0" w:firstColumn="0" w:lastColumn="0" w:oddVBand="0" w:evenVBand="0" w:oddHBand="1" w:evenHBand="0" w:firstRowFirstColumn="0" w:firstRowLastColumn="0" w:lastRowFirstColumn="0" w:lastRowLastColumn="0"/>
-              <w:rPr>
-                <w:rFonts w:ascii="Times New Roman" w:hAnsi="Times New Roman" w:cs="Times New Roman"/>
-              </w:rPr>
-            </w:pPr>
-            <w:r>
-              <w:rPr>
-                <w:rFonts w:ascii="Times New Roman" w:hAnsi="Times New Roman" w:cs="Times New Roman"/>
-              </w:rPr>
-              <w:t>Đơn giản, không cần huấn luyện</w:t>
-            </w:r>
-          </w:p>
-        </w:tc>
-        <w:tc>
-          <w:tcPr>
-            <w:tcW w:w="1799" w:type="dxa"/>
-            <w:vAlign w:val="center"/>
-          </w:tcPr>
-          <w:p>
-            <w:pPr>
-              <w:jc w:val="center"/>
-              <w:cnfStyle w:val="000000100000" w:firstRow="0" w:lastRow="0" w:firstColumn="0" w:lastColumn="0" w:oddVBand="0" w:evenVBand="0" w:oddHBand="1" w:evenHBand="0" w:firstRowFirstColumn="0" w:firstRowLastColumn="0" w:lastRowFirstColumn="0" w:lastRowLastColumn="0"/>
-              <w:rPr>
-                <w:rFonts w:ascii="Times New Roman" w:hAnsi="Times New Roman" w:cs="Times New Roman"/>
-              </w:rPr>
-            </w:pPr>
-            <w:r>
-              <w:rPr>
-                <w:rFonts w:ascii="Times New Roman" w:hAnsi="Times New Roman" w:cs="Times New Roman"/>
-              </w:rPr>
-              <w:t>Chậm với dữ liệu lớn, dễ bị nhiễu</w:t>
-            </w:r>
-          </w:p>
-        </w:tc>
-        <w:tc>
-          <w:tcPr>
-            <w:tcW w:w="1799" w:type="dxa"/>
-            <w:vAlign w:val="center"/>
-          </w:tcPr>
-          <w:p>
-            <w:pPr>
-              <w:jc w:val="center"/>
-              <w:cnfStyle w:val="000000100000" w:firstRow="0" w:lastRow="0" w:firstColumn="0" w:lastColumn="0" w:oddVBand="0" w:evenVBand="0" w:oddHBand="1" w:evenHBand="0" w:firstRowFirstColumn="0" w:firstRowLastColumn="0" w:lastRowFirstColumn="0" w:lastRowLastColumn="0"/>
-              <w:rPr>
-                <w:rFonts w:ascii="Times New Roman" w:hAnsi="Times New Roman" w:cs="Times New Roman"/>
-              </w:rPr>
-            </w:pPr>
-            <w:r>
-              <w:rPr>
-                <w:rFonts w:ascii="Times New Roman" w:hAnsi="Times New Roman" w:cs="Times New Roman"/>
-              </w:rPr>
-              <w:t>Nhận dạng ảnh, phân loại văn bản nhỏ</w:t>
-            </w:r>
-          </w:p>
-        </w:tc>
-      </w:tr>
-      <w:tr>
-        <w:tc>
-          <w:tcPr>
-            <w:cnfStyle w:val="001000000000" w:firstRow="0" w:lastRow="0" w:firstColumn="1" w:lastColumn="0" w:oddVBand="0" w:evenVBand="0" w:oddHBand="0" w:evenHBand="0" w:firstRowFirstColumn="0" w:firstRowLastColumn="0" w:lastRowFirstColumn="0" w:lastRowLastColumn="0"/>
-            <w:tcW w:w="1525" w:type="dxa"/>
-            <w:vAlign w:val="center"/>
-          </w:tcPr>
-          <w:p>
-            <w:pPr>
-              <w:jc w:val="center"/>
-              <w:rPr>
-                <w:rFonts w:ascii="Times New Roman" w:hAnsi="Times New Roman" w:cs="Times New Roman"/>
-                <w:b w:val="0"/>
-                <w:bCs w:val="0"/>
-              </w:rPr>
-            </w:pPr>
-            <w:r>
-              <w:rPr>
-                <w:rFonts w:ascii="Times New Roman" w:hAnsi="Times New Roman" w:cs="Times New Roman"/>
-              </w:rPr>
-              <w:t>Binary Classification</w:t>
-            </w:r>
-          </w:p>
-        </w:tc>
-        <w:tc>
-          <w:tcPr>
-            <w:tcW w:w="2071" w:type="dxa"/>
+              <w:t xml:space="preserve"> Logistic Regresssion</w:t>
+            </w:r>
+          </w:p>
+        </w:tc>
+        <w:tc>
+          <w:tcPr>
+            <w:tcW w:w="1297" w:type="dxa"/>
             <w:vAlign w:val="center"/>
           </w:tcPr>
           <w:p>
@@ -802,13 +732,13 @@
               <w:rPr>
                 <w:rFonts w:ascii="Times New Roman" w:hAnsi="Times New Roman" w:cs="Times New Roman"/>
               </w:rPr>
-              <w:t>Phân loại 2 lớp</w:t>
-            </w:r>
-          </w:p>
-        </w:tc>
-        <w:tc>
-          <w:tcPr>
-            <w:tcW w:w="1798" w:type="dxa"/>
+              <w:t>Class</w:t>
+            </w:r>
+          </w:p>
+        </w:tc>
+        <w:tc>
+          <w:tcPr>
+            <w:tcW w:w="1328" w:type="dxa"/>
             <w:vAlign w:val="center"/>
           </w:tcPr>
           <w:p>
@@ -823,13 +753,13 @@
               <w:rPr>
                 <w:rFonts w:ascii="Times New Roman" w:hAnsi="Times New Roman" w:cs="Times New Roman"/>
               </w:rPr>
-              <w:t>Dùng các mô hình như Logistic Regression, SVM, v.v</w:t>
-            </w:r>
-          </w:p>
-        </w:tc>
-        <w:tc>
-          <w:tcPr>
-            <w:tcW w:w="1798" w:type="dxa"/>
+              <w:t>Tuyến tính</w:t>
+            </w:r>
+          </w:p>
+        </w:tc>
+        <w:tc>
+          <w:tcPr>
+            <w:tcW w:w="1939" w:type="dxa"/>
             <w:vAlign w:val="center"/>
           </w:tcPr>
           <w:p>
@@ -844,13 +774,13 @@
               <w:rPr>
                 <w:rFonts w:ascii="Times New Roman" w:hAnsi="Times New Roman" w:cs="Times New Roman"/>
               </w:rPr>
-              <w:t>Khái niệm cơ bản của ML, nhiều thước đo đánh giá</w:t>
-            </w:r>
-          </w:p>
-        </w:tc>
-        <w:tc>
-          <w:tcPr>
-            <w:tcW w:w="1799" w:type="dxa"/>
+              <w:t>Dùng sigmoid/softmax để phân loại</w:t>
+            </w:r>
+          </w:p>
+        </w:tc>
+        <w:tc>
+          <w:tcPr>
+            <w:tcW w:w="1374" w:type="dxa"/>
             <w:vAlign w:val="center"/>
           </w:tcPr>
           <w:p>
@@ -865,13 +795,13 @@
               <w:rPr>
                 <w:rFonts w:ascii="Times New Roman" w:hAnsi="Times New Roman" w:cs="Times New Roman"/>
               </w:rPr>
-              <w:t>Dễ mất cân bằng dữ liệu</w:t>
-            </w:r>
-          </w:p>
-        </w:tc>
-        <w:tc>
-          <w:tcPr>
-            <w:tcW w:w="1799" w:type="dxa"/>
+              <w:t>Xác suất rõ ràng, dễ hiểu</w:t>
+            </w:r>
+          </w:p>
+        </w:tc>
+        <w:tc>
+          <w:tcPr>
+            <w:tcW w:w="1450" w:type="dxa"/>
             <w:vAlign w:val="center"/>
           </w:tcPr>
           <w:p>
@@ -886,7 +816,28 @@
               <w:rPr>
                 <w:rFonts w:ascii="Times New Roman" w:hAnsi="Times New Roman" w:cs="Times New Roman"/>
               </w:rPr>
-              <w:t>Email spam, chuẩn đoán y tế</w:t>
+              <w:t>Kém với phi tuyến</w:t>
+            </w:r>
+          </w:p>
+        </w:tc>
+        <w:tc>
+          <w:tcPr>
+            <w:tcW w:w="2108" w:type="dxa"/>
+            <w:vAlign w:val="center"/>
+          </w:tcPr>
+          <w:p>
+            <w:pPr>
+              <w:jc w:val="center"/>
+              <w:cnfStyle w:val="000000000000" w:firstRow="0" w:lastRow="0" w:firstColumn="0" w:lastColumn="0" w:oddVBand="0" w:evenVBand="0" w:oddHBand="0" w:evenHBand="0" w:firstRowFirstColumn="0" w:firstRowLastColumn="0" w:lastRowFirstColumn="0" w:lastRowLastColumn="0"/>
+              <w:rPr>
+                <w:rFonts w:ascii="Times New Roman" w:hAnsi="Times New Roman" w:cs="Times New Roman"/>
+              </w:rPr>
+            </w:pPr>
+            <w:r>
+              <w:rPr>
+                <w:rFonts w:ascii="Times New Roman" w:hAnsi="Times New Roman" w:cs="Times New Roman"/>
+              </w:rPr>
+              <w:t>Spam detection</w:t>
             </w:r>
           </w:p>
         </w:tc>
@@ -894,20 +845,19 @@
       <w:tr>
         <w:trPr>
           <w:cnfStyle w:val="000000100000" w:firstRow="0" w:lastRow="0" w:firstColumn="0" w:lastColumn="0" w:oddVBand="0" w:evenVBand="0" w:oddHBand="1" w:evenHBand="0" w:firstRowFirstColumn="0" w:firstRowLastColumn="0" w:lastRowFirstColumn="0" w:lastRowLastColumn="0"/>
+          <w:jc w:val="center"/>
         </w:trPr>
         <w:tc>
           <w:tcPr>
             <w:cnfStyle w:val="001000000000" w:firstRow="0" w:lastRow="0" w:firstColumn="1" w:lastColumn="0" w:oddVBand="0" w:evenVBand="0" w:oddHBand="0" w:evenHBand="0" w:firstRowFirstColumn="0" w:firstRowLastColumn="0" w:lastRowFirstColumn="0" w:lastRowLastColumn="0"/>
-            <w:tcW w:w="1525" w:type="dxa"/>
-            <w:vAlign w:val="center"/>
-          </w:tcPr>
-          <w:p>
-            <w:pPr>
-              <w:jc w:val="center"/>
-              <w:rPr>
-                <w:rFonts w:ascii="Times New Roman" w:hAnsi="Times New Roman" w:cs="Times New Roman"/>
-                <w:b w:val="0"/>
-                <w:bCs w:val="0"/>
+            <w:tcW w:w="2257" w:type="dxa"/>
+            <w:vAlign w:val="center"/>
+          </w:tcPr>
+          <w:p>
+            <w:pPr>
+              <w:jc w:val="center"/>
+              <w:rPr>
+                <w:rFonts w:ascii="Times New Roman" w:hAnsi="Times New Roman" w:cs="Times New Roman"/>
               </w:rPr>
             </w:pPr>
             <w:r>
@@ -920,7 +870,7 @@
         </w:tc>
         <w:tc>
           <w:tcPr>
-            <w:tcW w:w="2071" w:type="dxa"/>
+            <w:tcW w:w="1297" w:type="dxa"/>
             <w:vAlign w:val="center"/>
           </w:tcPr>
           <w:p>
@@ -935,19 +885,13 @@
               <w:rPr>
                 <w:rFonts w:ascii="Times New Roman" w:hAnsi="Times New Roman" w:cs="Times New Roman"/>
               </w:rPr>
-              <w:t xml:space="preserve">Chia dữ liệu theo đặc </w:t>
-            </w:r>
-            <w:r>
-              <w:rPr>
-                <w:rFonts w:ascii="Times New Roman" w:hAnsi="Times New Roman" w:cs="Times New Roman"/>
-              </w:rPr>
-              <w:t>trưng để tìm ra quyết định</w:t>
-            </w:r>
-          </w:p>
-        </w:tc>
-        <w:tc>
-          <w:tcPr>
-            <w:tcW w:w="1798" w:type="dxa"/>
+              <w:t>Regression / Class</w:t>
+            </w:r>
+          </w:p>
+        </w:tc>
+        <w:tc>
+          <w:tcPr>
+            <w:tcW w:w="1328" w:type="dxa"/>
             <w:vAlign w:val="center"/>
           </w:tcPr>
           <w:p>
@@ -962,13 +906,13 @@
               <w:rPr>
                 <w:rFonts w:ascii="Times New Roman" w:hAnsi="Times New Roman" w:cs="Times New Roman"/>
               </w:rPr>
-              <w:t>Dùng Entropy / Gini để chọn split</w:t>
-            </w:r>
-          </w:p>
-        </w:tc>
-        <w:tc>
-          <w:tcPr>
-            <w:tcW w:w="1798" w:type="dxa"/>
+              <w:t>Phi tuyến</w:t>
+            </w:r>
+          </w:p>
+        </w:tc>
+        <w:tc>
+          <w:tcPr>
+            <w:tcW w:w="1939" w:type="dxa"/>
             <w:vAlign w:val="center"/>
           </w:tcPr>
           <w:p>
@@ -983,13 +927,34 @@
               <w:rPr>
                 <w:rFonts w:ascii="Times New Roman" w:hAnsi="Times New Roman" w:cs="Times New Roman"/>
               </w:rPr>
+              <w:t>Chia node theo feature (Entropy, Gini)</w:t>
+            </w:r>
+          </w:p>
+        </w:tc>
+        <w:tc>
+          <w:tcPr>
+            <w:tcW w:w="1374" w:type="dxa"/>
+            <w:vAlign w:val="center"/>
+          </w:tcPr>
+          <w:p>
+            <w:pPr>
+              <w:jc w:val="center"/>
+              <w:cnfStyle w:val="000000100000" w:firstRow="0" w:lastRow="0" w:firstColumn="0" w:lastColumn="0" w:oddVBand="0" w:evenVBand="0" w:oddHBand="1" w:evenHBand="0" w:firstRowFirstColumn="0" w:firstRowLastColumn="0" w:lastRowFirstColumn="0" w:lastRowLastColumn="0"/>
+              <w:rPr>
+                <w:rFonts w:ascii="Times New Roman" w:hAnsi="Times New Roman" w:cs="Times New Roman"/>
+              </w:rPr>
+            </w:pPr>
+            <w:r>
+              <w:rPr>
+                <w:rFonts w:ascii="Times New Roman" w:hAnsi="Times New Roman" w:cs="Times New Roman"/>
+              </w:rPr>
               <w:t>Dễ hiểu, trực quan</w:t>
             </w:r>
           </w:p>
         </w:tc>
         <w:tc>
           <w:tcPr>
-            <w:tcW w:w="1799" w:type="dxa"/>
+            <w:tcW w:w="1450" w:type="dxa"/>
             <w:vAlign w:val="center"/>
           </w:tcPr>
           <w:p>
@@ -1004,13 +969,13 @@
               <w:rPr>
                 <w:rFonts w:ascii="Times New Roman" w:hAnsi="Times New Roman" w:cs="Times New Roman"/>
               </w:rPr>
-              <w:t>Dễ overfit, cần pruning</w:t>
-            </w:r>
-          </w:p>
-        </w:tc>
-        <w:tc>
-          <w:tcPr>
-            <w:tcW w:w="1799" w:type="dxa"/>
+              <w:t>Overfit, không ổn định</w:t>
+            </w:r>
+          </w:p>
+        </w:tc>
+        <w:tc>
+          <w:tcPr>
+            <w:tcW w:w="2108" w:type="dxa"/>
             <w:vAlign w:val="center"/>
           </w:tcPr>
           <w:p>
@@ -1025,38 +990,39 @@
               <w:rPr>
                 <w:rFonts w:ascii="Times New Roman" w:hAnsi="Times New Roman" w:cs="Times New Roman"/>
               </w:rPr>
-              <w:t>Dự đoán khách hàng rời bỏ, chấm điểm tín dùng</w:t>
+              <w:t>Chấm điểm tín dụng</w:t>
             </w:r>
           </w:p>
         </w:tc>
       </w:tr>
       <w:tr>
+        <w:trPr>
+          <w:jc w:val="center"/>
+        </w:trPr>
         <w:tc>
           <w:tcPr>
             <w:cnfStyle w:val="001000000000" w:firstRow="0" w:lastRow="0" w:firstColumn="1" w:lastColumn="0" w:oddVBand="0" w:evenVBand="0" w:oddHBand="0" w:evenHBand="0" w:firstRowFirstColumn="0" w:firstRowLastColumn="0" w:lastRowFirstColumn="0" w:lastRowLastColumn="0"/>
-            <w:tcW w:w="1525" w:type="dxa"/>
-            <w:vAlign w:val="center"/>
-          </w:tcPr>
-          <w:p>
-            <w:pPr>
-              <w:jc w:val="center"/>
-              <w:rPr>
-                <w:rFonts w:ascii="Times New Roman" w:hAnsi="Times New Roman" w:cs="Times New Roman"/>
-                <w:b w:val="0"/>
-                <w:bCs w:val="0"/>
-              </w:rPr>
-            </w:pPr>
-            <w:r>
-              <w:rPr>
-                <w:rFonts w:ascii="Times New Roman" w:hAnsi="Times New Roman" w:cs="Times New Roman"/>
-              </w:rPr>
-              <w:t>K-Clustering (K-means)</w:t>
-            </w:r>
-          </w:p>
-        </w:tc>
-        <w:tc>
-          <w:tcPr>
-            <w:tcW w:w="2071" w:type="dxa"/>
+            <w:tcW w:w="2257" w:type="dxa"/>
+            <w:vAlign w:val="center"/>
+          </w:tcPr>
+          <w:p>
+            <w:pPr>
+              <w:jc w:val="center"/>
+              <w:rPr>
+                <w:rFonts w:ascii="Times New Roman" w:hAnsi="Times New Roman" w:cs="Times New Roman"/>
+              </w:rPr>
+            </w:pPr>
+            <w:r>
+              <w:rPr>
+                <w:rFonts w:ascii="Times New Roman" w:hAnsi="Times New Roman" w:cs="Times New Roman"/>
+              </w:rPr>
+              <w:t>Random Forest (Classifier/Regressor)</w:t>
+            </w:r>
+          </w:p>
+        </w:tc>
+        <w:tc>
+          <w:tcPr>
+            <w:tcW w:w="1297" w:type="dxa"/>
             <w:vAlign w:val="center"/>
           </w:tcPr>
           <w:p>
@@ -1071,13 +1037,13 @@
               <w:rPr>
                 <w:rFonts w:ascii="Times New Roman" w:hAnsi="Times New Roman" w:cs="Times New Roman"/>
               </w:rPr>
-              <w:t>Gom nhóm dữ liệu dựa trên độ gần centroid</w:t>
-            </w:r>
-          </w:p>
-        </w:tc>
-        <w:tc>
-          <w:tcPr>
-            <w:tcW w:w="1798" w:type="dxa"/>
+              <w:t>Regression / Class</w:t>
+            </w:r>
+          </w:p>
+        </w:tc>
+        <w:tc>
+          <w:tcPr>
+            <w:tcW w:w="1328" w:type="dxa"/>
             <w:vAlign w:val="center"/>
           </w:tcPr>
           <w:p>
@@ -1092,7 +1058,28 @@
               <w:rPr>
                 <w:rFonts w:ascii="Times New Roman" w:hAnsi="Times New Roman" w:cs="Times New Roman"/>
               </w:rPr>
-              <w:t xml:space="preserve">Lặp lại: gán điểm </w:t>
+              <w:t>Phi tuyến</w:t>
+            </w:r>
+          </w:p>
+        </w:tc>
+        <w:tc>
+          <w:tcPr>
+            <w:tcW w:w="1939" w:type="dxa"/>
+            <w:vAlign w:val="center"/>
+          </w:tcPr>
+          <w:p>
+            <w:pPr>
+              <w:jc w:val="center"/>
+              <w:cnfStyle w:val="000000000000" w:firstRow="0" w:lastRow="0" w:firstColumn="0" w:lastColumn="0" w:oddVBand="0" w:evenVBand="0" w:oddHBand="0" w:evenHBand="0" w:firstRowFirstColumn="0" w:firstRowLastColumn="0" w:lastRowFirstColumn="0" w:lastRowLastColumn="0"/>
+              <w:rPr>
+                <w:rFonts w:ascii="Times New Roman" w:hAnsi="Times New Roman" w:cs="Times New Roman"/>
+              </w:rPr>
+            </w:pPr>
+            <w:r>
+              <w:rPr>
+                <w:rFonts w:ascii="Times New Roman" w:hAnsi="Times New Roman" w:cs="Times New Roman"/>
+              </w:rPr>
+              <w:t xml:space="preserve">Bagging nhiều cây </w:t>
             </w:r>
             <m:oMath>
               <m:r>
@@ -1106,27 +1093,25 @@
               <w:rPr>
                 <w:rFonts w:ascii="Times New Roman" w:eastAsiaTheme="minorEastAsia" w:hAnsi="Times New Roman" w:cs="Times New Roman"/>
               </w:rPr>
-              <w:t xml:space="preserve"> cập nhật centroid </w:t>
-            </w:r>
-            <m:oMath>
-              <m:r>
-                <w:rPr>
-                  <w:rFonts w:ascii="Cambria Math" w:hAnsi="Cambria Math" w:cs="Times New Roman"/>
-                </w:rPr>
-                <m:t>→</m:t>
-              </m:r>
-            </m:oMath>
+              <w:t xml:space="preserve"> </w:t>
+            </w:r>
             <w:r>
               <w:rPr>
                 <w:rFonts w:ascii="Times New Roman" w:eastAsiaTheme="minorEastAsia" w:hAnsi="Times New Roman" w:cs="Times New Roman"/>
               </w:rPr>
-              <w:t xml:space="preserve"> lặp</w:t>
-            </w:r>
-          </w:p>
-        </w:tc>
-        <w:tc>
-          <w:tcPr>
-            <w:tcW w:w="1798" w:type="dxa"/>
+              <w:t>voting/average</w:t>
+            </w:r>
+            <w:r>
+              <w:rPr>
+                <w:rFonts w:ascii="Times New Roman" w:hAnsi="Times New Roman" w:cs="Times New Roman"/>
+              </w:rPr>
+              <w:t xml:space="preserve"> </w:t>
+            </w:r>
+          </w:p>
+        </w:tc>
+        <w:tc>
+          <w:tcPr>
+            <w:tcW w:w="1374" w:type="dxa"/>
             <w:vAlign w:val="center"/>
           </w:tcPr>
           <w:p>
@@ -1141,13 +1126,13 @@
               <w:rPr>
                 <w:rFonts w:ascii="Times New Roman" w:hAnsi="Times New Roman" w:cs="Times New Roman"/>
               </w:rPr>
-              <w:t>Đơn giản, hiệu quả với dữ liệu lớn</w:t>
-            </w:r>
-          </w:p>
-        </w:tc>
-        <w:tc>
-          <w:tcPr>
-            <w:tcW w:w="1799" w:type="dxa"/>
+              <w:t>Mạnh, ít overfit hơn tree đơn</w:t>
+            </w:r>
+          </w:p>
+        </w:tc>
+        <w:tc>
+          <w:tcPr>
+            <w:tcW w:w="1450" w:type="dxa"/>
             <w:vAlign w:val="center"/>
           </w:tcPr>
           <w:p>
@@ -1162,13 +1147,13 @@
               <w:rPr>
                 <w:rFonts w:ascii="Times New Roman" w:hAnsi="Times New Roman" w:cs="Times New Roman"/>
               </w:rPr>
-              <w:t>Cần chọn K trước, nhạy cảm với outlier</w:t>
-            </w:r>
-          </w:p>
-        </w:tc>
-        <w:tc>
-          <w:tcPr>
-            <w:tcW w:w="1799" w:type="dxa"/>
+              <w:t>Chậm, khó giải thích</w:t>
+            </w:r>
+          </w:p>
+        </w:tc>
+        <w:tc>
+          <w:tcPr>
+            <w:tcW w:w="2108" w:type="dxa"/>
             <w:vAlign w:val="center"/>
           </w:tcPr>
           <w:p>
@@ -1183,7 +1168,1090 @@
               <w:rPr>
                 <w:rFonts w:ascii="Times New Roman" w:hAnsi="Times New Roman" w:cs="Times New Roman"/>
               </w:rPr>
-              <w:t>Phân khúc khách hàng, nén ảnh</w:t>
+              <w:t>Khách hàng rời bỏ, dự đoán giá</w:t>
+            </w:r>
+          </w:p>
+        </w:tc>
+      </w:tr>
+      <w:tr>
+        <w:trPr>
+          <w:cnfStyle w:val="000000100000" w:firstRow="0" w:lastRow="0" w:firstColumn="0" w:lastColumn="0" w:oddVBand="0" w:evenVBand="0" w:oddHBand="1" w:evenHBand="0" w:firstRowFirstColumn="0" w:firstRowLastColumn="0" w:lastRowFirstColumn="0" w:lastRowLastColumn="0"/>
+          <w:jc w:val="center"/>
+        </w:trPr>
+        <w:tc>
+          <w:tcPr>
+            <w:cnfStyle w:val="001000000000" w:firstRow="0" w:lastRow="0" w:firstColumn="1" w:lastColumn="0" w:oddVBand="0" w:evenVBand="0" w:oddHBand="0" w:evenHBand="0" w:firstRowFirstColumn="0" w:firstRowLastColumn="0" w:lastRowFirstColumn="0" w:lastRowLastColumn="0"/>
+            <w:tcW w:w="2257" w:type="dxa"/>
+            <w:vAlign w:val="center"/>
+          </w:tcPr>
+          <w:p>
+            <w:pPr>
+              <w:jc w:val="center"/>
+              <w:rPr>
+                <w:rFonts w:ascii="Times New Roman" w:hAnsi="Times New Roman" w:cs="Times New Roman"/>
+              </w:rPr>
+            </w:pPr>
+            <w:r>
+              <w:rPr>
+                <w:rFonts w:ascii="Times New Roman" w:hAnsi="Times New Roman" w:cs="Times New Roman"/>
+              </w:rPr>
+              <w:t>Gradient Boosting (Classifier/Regressor)</w:t>
+            </w:r>
+          </w:p>
+        </w:tc>
+        <w:tc>
+          <w:tcPr>
+            <w:tcW w:w="1297" w:type="dxa"/>
+            <w:vAlign w:val="center"/>
+          </w:tcPr>
+          <w:p>
+            <w:pPr>
+              <w:jc w:val="center"/>
+              <w:cnfStyle w:val="000000100000" w:firstRow="0" w:lastRow="0" w:firstColumn="0" w:lastColumn="0" w:oddVBand="0" w:evenVBand="0" w:oddHBand="1" w:evenHBand="0" w:firstRowFirstColumn="0" w:firstRowLastColumn="0" w:lastRowFirstColumn="0" w:lastRowLastColumn="0"/>
+              <w:rPr>
+                <w:rFonts w:ascii="Times New Roman" w:hAnsi="Times New Roman" w:cs="Times New Roman"/>
+              </w:rPr>
+            </w:pPr>
+            <w:r>
+              <w:rPr>
+                <w:rFonts w:ascii="Times New Roman" w:hAnsi="Times New Roman" w:cs="Times New Roman"/>
+              </w:rPr>
+              <w:t>Regression / Class</w:t>
+            </w:r>
+          </w:p>
+        </w:tc>
+        <w:tc>
+          <w:tcPr>
+            <w:tcW w:w="1328" w:type="dxa"/>
+            <w:vAlign w:val="center"/>
+          </w:tcPr>
+          <w:p>
+            <w:pPr>
+              <w:jc w:val="center"/>
+              <w:cnfStyle w:val="000000100000" w:firstRow="0" w:lastRow="0" w:firstColumn="0" w:lastColumn="0" w:oddVBand="0" w:evenVBand="0" w:oddHBand="1" w:evenHBand="0" w:firstRowFirstColumn="0" w:firstRowLastColumn="0" w:lastRowFirstColumn="0" w:lastRowLastColumn="0"/>
+              <w:rPr>
+                <w:rFonts w:ascii="Times New Roman" w:hAnsi="Times New Roman" w:cs="Times New Roman"/>
+              </w:rPr>
+            </w:pPr>
+            <w:r>
+              <w:rPr>
+                <w:rFonts w:ascii="Times New Roman" w:hAnsi="Times New Roman" w:cs="Times New Roman"/>
+              </w:rPr>
+              <w:t>Phi tuyến</w:t>
+            </w:r>
+          </w:p>
+        </w:tc>
+        <w:tc>
+          <w:tcPr>
+            <w:tcW w:w="1939" w:type="dxa"/>
+            <w:vAlign w:val="center"/>
+          </w:tcPr>
+          <w:p>
+            <w:pPr>
+              <w:jc w:val="center"/>
+              <w:cnfStyle w:val="000000100000" w:firstRow="0" w:lastRow="0" w:firstColumn="0" w:lastColumn="0" w:oddVBand="0" w:evenVBand="0" w:oddHBand="1" w:evenHBand="0" w:firstRowFirstColumn="0" w:firstRowLastColumn="0" w:lastRowFirstColumn="0" w:lastRowLastColumn="0"/>
+              <w:rPr>
+                <w:rFonts w:ascii="Times New Roman" w:hAnsi="Times New Roman" w:cs="Times New Roman"/>
+              </w:rPr>
+            </w:pPr>
+            <w:r>
+              <w:rPr>
+                <w:rFonts w:ascii="Times New Roman" w:hAnsi="Times New Roman" w:cs="Times New Roman"/>
+              </w:rPr>
+              <w:t>Boosting nhiều tree tuần tự</w:t>
+            </w:r>
+          </w:p>
+        </w:tc>
+        <w:tc>
+          <w:tcPr>
+            <w:tcW w:w="1374" w:type="dxa"/>
+            <w:vAlign w:val="center"/>
+          </w:tcPr>
+          <w:p>
+            <w:pPr>
+              <w:jc w:val="center"/>
+              <w:cnfStyle w:val="000000100000" w:firstRow="0" w:lastRow="0" w:firstColumn="0" w:lastColumn="0" w:oddVBand="0" w:evenVBand="0" w:oddHBand="1" w:evenHBand="0" w:firstRowFirstColumn="0" w:firstRowLastColumn="0" w:lastRowFirstColumn="0" w:lastRowLastColumn="0"/>
+              <w:rPr>
+                <w:rFonts w:ascii="Times New Roman" w:hAnsi="Times New Roman" w:cs="Times New Roman"/>
+              </w:rPr>
+            </w:pPr>
+            <w:r>
+              <w:rPr>
+                <w:rFonts w:ascii="Times New Roman" w:hAnsi="Times New Roman" w:cs="Times New Roman"/>
+              </w:rPr>
+              <w:t>Hiệu năng cao, mạnh</w:t>
+            </w:r>
+          </w:p>
+        </w:tc>
+        <w:tc>
+          <w:tcPr>
+            <w:tcW w:w="1450" w:type="dxa"/>
+            <w:vAlign w:val="center"/>
+          </w:tcPr>
+          <w:p>
+            <w:pPr>
+              <w:jc w:val="center"/>
+              <w:cnfStyle w:val="000000100000" w:firstRow="0" w:lastRow="0" w:firstColumn="0" w:lastColumn="0" w:oddVBand="0" w:evenVBand="0" w:oddHBand="1" w:evenHBand="0" w:firstRowFirstColumn="0" w:firstRowLastColumn="0" w:lastRowFirstColumn="0" w:lastRowLastColumn="0"/>
+              <w:rPr>
+                <w:rFonts w:ascii="Times New Roman" w:hAnsi="Times New Roman" w:cs="Times New Roman"/>
+              </w:rPr>
+            </w:pPr>
+            <w:r>
+              <w:rPr>
+                <w:rFonts w:ascii="Times New Roman" w:hAnsi="Times New Roman" w:cs="Times New Roman"/>
+              </w:rPr>
+              <w:t>Dễ overfit, tuning khó</w:t>
+            </w:r>
+          </w:p>
+        </w:tc>
+        <w:tc>
+          <w:tcPr>
+            <w:tcW w:w="2108" w:type="dxa"/>
+            <w:vAlign w:val="center"/>
+          </w:tcPr>
+          <w:p>
+            <w:pPr>
+              <w:jc w:val="center"/>
+              <w:cnfStyle w:val="000000100000" w:firstRow="0" w:lastRow="0" w:firstColumn="0" w:lastColumn="0" w:oddVBand="0" w:evenVBand="0" w:oddHBand="1" w:evenHBand="0" w:firstRowFirstColumn="0" w:firstRowLastColumn="0" w:lastRowFirstColumn="0" w:lastRowLastColumn="0"/>
+              <w:rPr>
+                <w:rFonts w:ascii="Times New Roman" w:hAnsi="Times New Roman" w:cs="Times New Roman"/>
+              </w:rPr>
+            </w:pPr>
+            <w:r>
+              <w:rPr>
+                <w:rFonts w:ascii="Times New Roman" w:hAnsi="Times New Roman" w:cs="Times New Roman"/>
+              </w:rPr>
+              <w:t>Kaggle thường dùng</w:t>
+            </w:r>
+          </w:p>
+        </w:tc>
+      </w:tr>
+      <w:tr>
+        <w:trPr>
+          <w:jc w:val="center"/>
+        </w:trPr>
+        <w:tc>
+          <w:tcPr>
+            <w:cnfStyle w:val="001000000000" w:firstRow="0" w:lastRow="0" w:firstColumn="1" w:lastColumn="0" w:oddVBand="0" w:evenVBand="0" w:oddHBand="0" w:evenHBand="0" w:firstRowFirstColumn="0" w:firstRowLastColumn="0" w:lastRowFirstColumn="0" w:lastRowLastColumn="0"/>
+            <w:tcW w:w="2257" w:type="dxa"/>
+            <w:vAlign w:val="center"/>
+          </w:tcPr>
+          <w:p>
+            <w:pPr>
+              <w:jc w:val="center"/>
+              <w:rPr>
+                <w:rFonts w:ascii="Times New Roman" w:hAnsi="Times New Roman" w:cs="Times New Roman"/>
+              </w:rPr>
+            </w:pPr>
+            <w:r>
+              <w:rPr>
+                <w:rFonts w:ascii="Times New Roman" w:hAnsi="Times New Roman" w:cs="Times New Roman"/>
+              </w:rPr>
+              <w:t xml:space="preserve">SVC </w:t>
+            </w:r>
+          </w:p>
+        </w:tc>
+        <w:tc>
+          <w:tcPr>
+            <w:tcW w:w="1297" w:type="dxa"/>
+            <w:vAlign w:val="center"/>
+          </w:tcPr>
+          <w:p>
+            <w:pPr>
+              <w:jc w:val="center"/>
+              <w:cnfStyle w:val="000000000000" w:firstRow="0" w:lastRow="0" w:firstColumn="0" w:lastColumn="0" w:oddVBand="0" w:evenVBand="0" w:oddHBand="0" w:evenHBand="0" w:firstRowFirstColumn="0" w:firstRowLastColumn="0" w:lastRowFirstColumn="0" w:lastRowLastColumn="0"/>
+              <w:rPr>
+                <w:rFonts w:ascii="Times New Roman" w:hAnsi="Times New Roman" w:cs="Times New Roman"/>
+              </w:rPr>
+            </w:pPr>
+            <w:r>
+              <w:rPr>
+                <w:rFonts w:ascii="Times New Roman" w:hAnsi="Times New Roman" w:cs="Times New Roman"/>
+              </w:rPr>
+              <w:t>Class</w:t>
+            </w:r>
+          </w:p>
+        </w:tc>
+        <w:tc>
+          <w:tcPr>
+            <w:tcW w:w="1328" w:type="dxa"/>
+            <w:vAlign w:val="center"/>
+          </w:tcPr>
+          <w:p>
+            <w:pPr>
+              <w:jc w:val="center"/>
+              <w:cnfStyle w:val="000000000000" w:firstRow="0" w:lastRow="0" w:firstColumn="0" w:lastColumn="0" w:oddVBand="0" w:evenVBand="0" w:oddHBand="0" w:evenHBand="0" w:firstRowFirstColumn="0" w:firstRowLastColumn="0" w:lastRowFirstColumn="0" w:lastRowLastColumn="0"/>
+              <w:rPr>
+                <w:rFonts w:ascii="Times New Roman" w:hAnsi="Times New Roman" w:cs="Times New Roman"/>
+              </w:rPr>
+            </w:pPr>
+            <w:r>
+              <w:rPr>
+                <w:rFonts w:ascii="Times New Roman" w:hAnsi="Times New Roman" w:cs="Times New Roman"/>
+              </w:rPr>
+              <w:t>Cả 2</w:t>
+            </w:r>
+          </w:p>
+        </w:tc>
+        <w:tc>
+          <w:tcPr>
+            <w:tcW w:w="1939" w:type="dxa"/>
+            <w:vAlign w:val="center"/>
+          </w:tcPr>
+          <w:p>
+            <w:pPr>
+              <w:jc w:val="center"/>
+              <w:cnfStyle w:val="000000000000" w:firstRow="0" w:lastRow="0" w:firstColumn="0" w:lastColumn="0" w:oddVBand="0" w:evenVBand="0" w:oddHBand="0" w:evenHBand="0" w:firstRowFirstColumn="0" w:firstRowLastColumn="0" w:lastRowFirstColumn="0" w:lastRowLastColumn="0"/>
+              <w:rPr>
+                <w:rFonts w:ascii="Times New Roman" w:hAnsi="Times New Roman" w:cs="Times New Roman"/>
+              </w:rPr>
+            </w:pPr>
+            <w:r>
+              <w:rPr>
+                <w:rFonts w:ascii="Times New Roman" w:hAnsi="Times New Roman" w:cs="Times New Roman"/>
+              </w:rPr>
+              <w:t>Tìm siêu phẳng max-margin, dùng kernel trick</w:t>
+            </w:r>
+          </w:p>
+        </w:tc>
+        <w:tc>
+          <w:tcPr>
+            <w:tcW w:w="1374" w:type="dxa"/>
+            <w:vAlign w:val="center"/>
+          </w:tcPr>
+          <w:p>
+            <w:pPr>
+              <w:jc w:val="center"/>
+              <w:cnfStyle w:val="000000000000" w:firstRow="0" w:lastRow="0" w:firstColumn="0" w:lastColumn="0" w:oddVBand="0" w:evenVBand="0" w:oddHBand="0" w:evenHBand="0" w:firstRowFirstColumn="0" w:firstRowLastColumn="0" w:lastRowFirstColumn="0" w:lastRowLastColumn="0"/>
+              <w:rPr>
+                <w:rFonts w:ascii="Times New Roman" w:hAnsi="Times New Roman" w:cs="Times New Roman"/>
+              </w:rPr>
+            </w:pPr>
+            <w:r>
+              <w:rPr>
+                <w:rFonts w:ascii="Times New Roman" w:hAnsi="Times New Roman" w:cs="Times New Roman"/>
+              </w:rPr>
+              <w:t>Hiệu quả với dữ liệu nhỏ, phi tuyến</w:t>
+            </w:r>
+          </w:p>
+        </w:tc>
+        <w:tc>
+          <w:tcPr>
+            <w:tcW w:w="1450" w:type="dxa"/>
+            <w:vAlign w:val="center"/>
+          </w:tcPr>
+          <w:p>
+            <w:pPr>
+              <w:jc w:val="center"/>
+              <w:cnfStyle w:val="000000000000" w:firstRow="0" w:lastRow="0" w:firstColumn="0" w:lastColumn="0" w:oddVBand="0" w:evenVBand="0" w:oddHBand="0" w:evenHBand="0" w:firstRowFirstColumn="0" w:firstRowLastColumn="0" w:lastRowFirstColumn="0" w:lastRowLastColumn="0"/>
+              <w:rPr>
+                <w:rFonts w:ascii="Times New Roman" w:hAnsi="Times New Roman" w:cs="Times New Roman"/>
+              </w:rPr>
+            </w:pPr>
+            <w:r>
+              <w:rPr>
+                <w:rFonts w:ascii="Times New Roman" w:hAnsi="Times New Roman" w:cs="Times New Roman"/>
+              </w:rPr>
+              <w:t>Tốn tính toán dữ liệu lớn</w:t>
+            </w:r>
+          </w:p>
+        </w:tc>
+        <w:tc>
+          <w:tcPr>
+            <w:tcW w:w="2108" w:type="dxa"/>
+            <w:vAlign w:val="center"/>
+          </w:tcPr>
+          <w:p>
+            <w:pPr>
+              <w:jc w:val="center"/>
+              <w:cnfStyle w:val="000000000000" w:firstRow="0" w:lastRow="0" w:firstColumn="0" w:lastColumn="0" w:oddVBand="0" w:evenVBand="0" w:oddHBand="0" w:evenHBand="0" w:firstRowFirstColumn="0" w:firstRowLastColumn="0" w:lastRowFirstColumn="0" w:lastRowLastColumn="0"/>
+              <w:rPr>
+                <w:rFonts w:ascii="Times New Roman" w:hAnsi="Times New Roman" w:cs="Times New Roman"/>
+              </w:rPr>
+            </w:pPr>
+            <w:r>
+              <w:rPr>
+                <w:rFonts w:ascii="Times New Roman" w:hAnsi="Times New Roman" w:cs="Times New Roman"/>
+              </w:rPr>
+              <w:t>Phân loại văn bản ảnh</w:t>
+            </w:r>
+          </w:p>
+        </w:tc>
+      </w:tr>
+      <w:tr>
+        <w:trPr>
+          <w:cnfStyle w:val="000000100000" w:firstRow="0" w:lastRow="0" w:firstColumn="0" w:lastColumn="0" w:oddVBand="0" w:evenVBand="0" w:oddHBand="1" w:evenHBand="0" w:firstRowFirstColumn="0" w:firstRowLastColumn="0" w:lastRowFirstColumn="0" w:lastRowLastColumn="0"/>
+          <w:jc w:val="center"/>
+        </w:trPr>
+        <w:tc>
+          <w:tcPr>
+            <w:cnfStyle w:val="001000000000" w:firstRow="0" w:lastRow="0" w:firstColumn="1" w:lastColumn="0" w:oddVBand="0" w:evenVBand="0" w:oddHBand="0" w:evenHBand="0" w:firstRowFirstColumn="0" w:firstRowLastColumn="0" w:lastRowFirstColumn="0" w:lastRowLastColumn="0"/>
+            <w:tcW w:w="2257" w:type="dxa"/>
+            <w:vAlign w:val="center"/>
+          </w:tcPr>
+          <w:p>
+            <w:pPr>
+              <w:jc w:val="center"/>
+              <w:rPr>
+                <w:rFonts w:ascii="Times New Roman" w:hAnsi="Times New Roman" w:cs="Times New Roman"/>
+              </w:rPr>
+            </w:pPr>
+            <w:r>
+              <w:rPr>
+                <w:rFonts w:ascii="Times New Roman" w:hAnsi="Times New Roman" w:cs="Times New Roman"/>
+              </w:rPr>
+              <w:t>SVR</w:t>
+            </w:r>
+          </w:p>
+        </w:tc>
+        <w:tc>
+          <w:tcPr>
+            <w:tcW w:w="1297" w:type="dxa"/>
+            <w:vAlign w:val="center"/>
+          </w:tcPr>
+          <w:p>
+            <w:pPr>
+              <w:jc w:val="center"/>
+              <w:cnfStyle w:val="000000100000" w:firstRow="0" w:lastRow="0" w:firstColumn="0" w:lastColumn="0" w:oddVBand="0" w:evenVBand="0" w:oddHBand="1" w:evenHBand="0" w:firstRowFirstColumn="0" w:firstRowLastColumn="0" w:lastRowFirstColumn="0" w:lastRowLastColumn="0"/>
+              <w:rPr>
+                <w:rFonts w:ascii="Times New Roman" w:hAnsi="Times New Roman" w:cs="Times New Roman"/>
+              </w:rPr>
+            </w:pPr>
+            <w:r>
+              <w:rPr>
+                <w:rFonts w:ascii="Times New Roman" w:hAnsi="Times New Roman" w:cs="Times New Roman"/>
+              </w:rPr>
+              <w:t>Regression</w:t>
+            </w:r>
+          </w:p>
+        </w:tc>
+        <w:tc>
+          <w:tcPr>
+            <w:tcW w:w="1328" w:type="dxa"/>
+            <w:vAlign w:val="center"/>
+          </w:tcPr>
+          <w:p>
+            <w:pPr>
+              <w:jc w:val="center"/>
+              <w:cnfStyle w:val="000000100000" w:firstRow="0" w:lastRow="0" w:firstColumn="0" w:lastColumn="0" w:oddVBand="0" w:evenVBand="0" w:oddHBand="1" w:evenHBand="0" w:firstRowFirstColumn="0" w:firstRowLastColumn="0" w:lastRowFirstColumn="0" w:lastRowLastColumn="0"/>
+              <w:rPr>
+                <w:rFonts w:ascii="Times New Roman" w:hAnsi="Times New Roman" w:cs="Times New Roman"/>
+              </w:rPr>
+            </w:pPr>
+            <w:r>
+              <w:rPr>
+                <w:rFonts w:ascii="Times New Roman" w:hAnsi="Times New Roman" w:cs="Times New Roman"/>
+              </w:rPr>
+              <w:t>Cả 2</w:t>
+            </w:r>
+          </w:p>
+        </w:tc>
+        <w:tc>
+          <w:tcPr>
+            <w:tcW w:w="1939" w:type="dxa"/>
+            <w:vAlign w:val="center"/>
+          </w:tcPr>
+          <w:p>
+            <w:pPr>
+              <w:jc w:val="center"/>
+              <w:cnfStyle w:val="000000100000" w:firstRow="0" w:lastRow="0" w:firstColumn="0" w:lastColumn="0" w:oddVBand="0" w:evenVBand="0" w:oddHBand="1" w:evenHBand="0" w:firstRowFirstColumn="0" w:firstRowLastColumn="0" w:lastRowFirstColumn="0" w:lastRowLastColumn="0"/>
+              <w:rPr>
+                <w:rFonts w:ascii="Times New Roman" w:hAnsi="Times New Roman" w:cs="Times New Roman"/>
+              </w:rPr>
+            </w:pPr>
+            <w:r>
+              <w:rPr>
+                <w:rFonts w:ascii="Times New Roman" w:hAnsi="Times New Roman" w:cs="Times New Roman"/>
+              </w:rPr>
+              <w:t xml:space="preserve">Hồi quy với khoản dung sai </w:t>
+            </w:r>
+            <w:r>
+              <w:t>ε</w:t>
+            </w:r>
+          </w:p>
+        </w:tc>
+        <w:tc>
+          <w:tcPr>
+            <w:tcW w:w="1374" w:type="dxa"/>
+            <w:vAlign w:val="center"/>
+          </w:tcPr>
+          <w:p>
+            <w:pPr>
+              <w:jc w:val="center"/>
+              <w:cnfStyle w:val="000000100000" w:firstRow="0" w:lastRow="0" w:firstColumn="0" w:lastColumn="0" w:oddVBand="0" w:evenVBand="0" w:oddHBand="1" w:evenHBand="0" w:firstRowFirstColumn="0" w:firstRowLastColumn="0" w:lastRowFirstColumn="0" w:lastRowLastColumn="0"/>
+              <w:rPr>
+                <w:rFonts w:ascii="Times New Roman" w:hAnsi="Times New Roman" w:cs="Times New Roman"/>
+              </w:rPr>
+            </w:pPr>
+            <w:r>
+              <w:rPr>
+                <w:rFonts w:ascii="Times New Roman" w:hAnsi="Times New Roman" w:cs="Times New Roman"/>
+              </w:rPr>
+              <w:t>Bắt phi tuyến tốt</w:t>
+            </w:r>
+          </w:p>
+        </w:tc>
+        <w:tc>
+          <w:tcPr>
+            <w:tcW w:w="1450" w:type="dxa"/>
+            <w:vAlign w:val="center"/>
+          </w:tcPr>
+          <w:p>
+            <w:pPr>
+              <w:jc w:val="center"/>
+              <w:cnfStyle w:val="000000100000" w:firstRow="0" w:lastRow="0" w:firstColumn="0" w:lastColumn="0" w:oddVBand="0" w:evenVBand="0" w:oddHBand="1" w:evenHBand="0" w:firstRowFirstColumn="0" w:firstRowLastColumn="0" w:lastRowFirstColumn="0" w:lastRowLastColumn="0"/>
+              <w:rPr>
+                <w:rFonts w:ascii="Times New Roman" w:hAnsi="Times New Roman" w:cs="Times New Roman"/>
+              </w:rPr>
+            </w:pPr>
+            <w:r>
+              <w:rPr>
+                <w:rFonts w:ascii="Times New Roman" w:hAnsi="Times New Roman" w:cs="Times New Roman"/>
+              </w:rPr>
+              <w:t>Khó chọn kernel, chậm</w:t>
+            </w:r>
+          </w:p>
+        </w:tc>
+        <w:tc>
+          <w:tcPr>
+            <w:tcW w:w="2108" w:type="dxa"/>
+            <w:vAlign w:val="center"/>
+          </w:tcPr>
+          <w:p>
+            <w:pPr>
+              <w:jc w:val="center"/>
+              <w:cnfStyle w:val="000000100000" w:firstRow="0" w:lastRow="0" w:firstColumn="0" w:lastColumn="0" w:oddVBand="0" w:evenVBand="0" w:oddHBand="1" w:evenHBand="0" w:firstRowFirstColumn="0" w:firstRowLastColumn="0" w:lastRowFirstColumn="0" w:lastRowLastColumn="0"/>
+              <w:rPr>
+                <w:rFonts w:ascii="Times New Roman" w:hAnsi="Times New Roman" w:cs="Times New Roman"/>
+              </w:rPr>
+            </w:pPr>
+            <w:r>
+              <w:rPr>
+                <w:rFonts w:ascii="Times New Roman" w:hAnsi="Times New Roman" w:cs="Times New Roman"/>
+              </w:rPr>
+              <w:t>Dự báo chuỗi</w:t>
+            </w:r>
+          </w:p>
+        </w:tc>
+      </w:tr>
+      <w:tr>
+        <w:trPr>
+          <w:jc w:val="center"/>
+        </w:trPr>
+        <w:tc>
+          <w:tcPr>
+            <w:cnfStyle w:val="001000000000" w:firstRow="0" w:lastRow="0" w:firstColumn="1" w:lastColumn="0" w:oddVBand="0" w:evenVBand="0" w:oddHBand="0" w:evenHBand="0" w:firstRowFirstColumn="0" w:firstRowLastColumn="0" w:lastRowFirstColumn="0" w:lastRowLastColumn="0"/>
+            <w:tcW w:w="2257" w:type="dxa"/>
+            <w:vAlign w:val="center"/>
+          </w:tcPr>
+          <w:p>
+            <w:pPr>
+              <w:jc w:val="center"/>
+              <w:rPr>
+                <w:rFonts w:ascii="Times New Roman" w:hAnsi="Times New Roman" w:cs="Times New Roman"/>
+                <w:b w:val="0"/>
+                <w:bCs w:val="0"/>
+              </w:rPr>
+            </w:pPr>
+            <w:r>
+              <w:rPr>
+                <w:rFonts w:ascii="Times New Roman" w:hAnsi="Times New Roman" w:cs="Times New Roman"/>
+              </w:rPr>
+              <w:t>KNN Classifier</w:t>
+            </w:r>
+          </w:p>
+        </w:tc>
+        <w:tc>
+          <w:tcPr>
+            <w:tcW w:w="1297" w:type="dxa"/>
+            <w:vAlign w:val="center"/>
+          </w:tcPr>
+          <w:p>
+            <w:pPr>
+              <w:jc w:val="center"/>
+              <w:cnfStyle w:val="000000000000" w:firstRow="0" w:lastRow="0" w:firstColumn="0" w:lastColumn="0" w:oddVBand="0" w:evenVBand="0" w:oddHBand="0" w:evenHBand="0" w:firstRowFirstColumn="0" w:firstRowLastColumn="0" w:lastRowFirstColumn="0" w:lastRowLastColumn="0"/>
+              <w:rPr>
+                <w:rFonts w:ascii="Times New Roman" w:hAnsi="Times New Roman" w:cs="Times New Roman"/>
+              </w:rPr>
+            </w:pPr>
+            <w:r>
+              <w:rPr>
+                <w:rFonts w:ascii="Times New Roman" w:hAnsi="Times New Roman" w:cs="Times New Roman"/>
+              </w:rPr>
+              <w:t>Class</w:t>
+            </w:r>
+          </w:p>
+        </w:tc>
+        <w:tc>
+          <w:tcPr>
+            <w:tcW w:w="1328" w:type="dxa"/>
+            <w:vAlign w:val="center"/>
+          </w:tcPr>
+          <w:p>
+            <w:pPr>
+              <w:jc w:val="center"/>
+              <w:cnfStyle w:val="000000000000" w:firstRow="0" w:lastRow="0" w:firstColumn="0" w:lastColumn="0" w:oddVBand="0" w:evenVBand="0" w:oddHBand="0" w:evenHBand="0" w:firstRowFirstColumn="0" w:firstRowLastColumn="0" w:lastRowFirstColumn="0" w:lastRowLastColumn="0"/>
+              <w:rPr>
+                <w:rFonts w:ascii="Times New Roman" w:hAnsi="Times New Roman" w:cs="Times New Roman"/>
+              </w:rPr>
+            </w:pPr>
+            <w:r>
+              <w:rPr>
+                <w:rFonts w:ascii="Times New Roman" w:hAnsi="Times New Roman" w:cs="Times New Roman"/>
+              </w:rPr>
+              <w:t>Phi tuyến</w:t>
+            </w:r>
+          </w:p>
+        </w:tc>
+        <w:tc>
+          <w:tcPr>
+            <w:tcW w:w="1939" w:type="dxa"/>
+            <w:vAlign w:val="center"/>
+          </w:tcPr>
+          <w:p>
+            <w:pPr>
+              <w:jc w:val="center"/>
+              <w:cnfStyle w:val="000000000000" w:firstRow="0" w:lastRow="0" w:firstColumn="0" w:lastColumn="0" w:oddVBand="0" w:evenVBand="0" w:oddHBand="0" w:evenHBand="0" w:firstRowFirstColumn="0" w:firstRowLastColumn="0" w:lastRowFirstColumn="0" w:lastRowLastColumn="0"/>
+              <w:rPr>
+                <w:rFonts w:ascii="Times New Roman" w:hAnsi="Times New Roman" w:cs="Times New Roman"/>
+              </w:rPr>
+            </w:pPr>
+            <w:r>
+              <w:rPr>
+                <w:rFonts w:ascii="Times New Roman" w:hAnsi="Times New Roman" w:cs="Times New Roman"/>
+              </w:rPr>
+              <w:t>Dựa k láng giềng gần nhất</w:t>
+            </w:r>
+          </w:p>
+        </w:tc>
+        <w:tc>
+          <w:tcPr>
+            <w:tcW w:w="1374" w:type="dxa"/>
+            <w:vAlign w:val="center"/>
+          </w:tcPr>
+          <w:p>
+            <w:pPr>
+              <w:jc w:val="center"/>
+              <w:cnfStyle w:val="000000000000" w:firstRow="0" w:lastRow="0" w:firstColumn="0" w:lastColumn="0" w:oddVBand="0" w:evenVBand="0" w:oddHBand="0" w:evenHBand="0" w:firstRowFirstColumn="0" w:firstRowLastColumn="0" w:lastRowFirstColumn="0" w:lastRowLastColumn="0"/>
+              <w:rPr>
+                <w:rFonts w:ascii="Times New Roman" w:hAnsi="Times New Roman" w:cs="Times New Roman"/>
+              </w:rPr>
+            </w:pPr>
+            <w:r>
+              <w:rPr>
+                <w:rFonts w:ascii="Times New Roman" w:hAnsi="Times New Roman" w:cs="Times New Roman"/>
+              </w:rPr>
+              <w:t>Không cần train, trực quan</w:t>
+            </w:r>
+          </w:p>
+        </w:tc>
+        <w:tc>
+          <w:tcPr>
+            <w:tcW w:w="1450" w:type="dxa"/>
+            <w:vAlign w:val="center"/>
+          </w:tcPr>
+          <w:p>
+            <w:pPr>
+              <w:jc w:val="center"/>
+              <w:cnfStyle w:val="000000000000" w:firstRow="0" w:lastRow="0" w:firstColumn="0" w:lastColumn="0" w:oddVBand="0" w:evenVBand="0" w:oddHBand="0" w:evenHBand="0" w:firstRowFirstColumn="0" w:firstRowLastColumn="0" w:lastRowFirstColumn="0" w:lastRowLastColumn="0"/>
+              <w:rPr>
+                <w:rFonts w:ascii="Times New Roman" w:hAnsi="Times New Roman" w:cs="Times New Roman"/>
+              </w:rPr>
+            </w:pPr>
+            <w:r>
+              <w:rPr>
+                <w:rFonts w:ascii="Times New Roman" w:hAnsi="Times New Roman" w:cs="Times New Roman"/>
+              </w:rPr>
+              <w:t>Chậm dữ liệu lớn</w:t>
+            </w:r>
+            <w:r>
+              <w:rPr>
+                <w:rFonts w:ascii="Times New Roman" w:hAnsi="Times New Roman" w:cs="Times New Roman"/>
+              </w:rPr>
+              <w:t>, curse of dim</w:t>
+            </w:r>
+          </w:p>
+        </w:tc>
+        <w:tc>
+          <w:tcPr>
+            <w:tcW w:w="2108" w:type="dxa"/>
+            <w:vAlign w:val="center"/>
+          </w:tcPr>
+          <w:p>
+            <w:pPr>
+              <w:jc w:val="center"/>
+              <w:cnfStyle w:val="000000000000" w:firstRow="0" w:lastRow="0" w:firstColumn="0" w:lastColumn="0" w:oddVBand="0" w:evenVBand="0" w:oddHBand="0" w:evenHBand="0" w:firstRowFirstColumn="0" w:firstRowLastColumn="0" w:lastRowFirstColumn="0" w:lastRowLastColumn="0"/>
+              <w:rPr>
+                <w:rFonts w:ascii="Times New Roman" w:hAnsi="Times New Roman" w:cs="Times New Roman"/>
+              </w:rPr>
+            </w:pPr>
+            <w:r>
+              <w:rPr>
+                <w:rFonts w:ascii="Times New Roman" w:hAnsi="Times New Roman" w:cs="Times New Roman"/>
+              </w:rPr>
+              <w:t>Nhận dạng ảnh</w:t>
+            </w:r>
+          </w:p>
+        </w:tc>
+      </w:tr>
+      <w:tr>
+        <w:trPr>
+          <w:cnfStyle w:val="000000100000" w:firstRow="0" w:lastRow="0" w:firstColumn="0" w:lastColumn="0" w:oddVBand="0" w:evenVBand="0" w:oddHBand="1" w:evenHBand="0" w:firstRowFirstColumn="0" w:firstRowLastColumn="0" w:lastRowFirstColumn="0" w:lastRowLastColumn="0"/>
+          <w:jc w:val="center"/>
+        </w:trPr>
+        <w:tc>
+          <w:tcPr>
+            <w:cnfStyle w:val="001000000000" w:firstRow="0" w:lastRow="0" w:firstColumn="1" w:lastColumn="0" w:oddVBand="0" w:evenVBand="0" w:oddHBand="0" w:evenHBand="0" w:firstRowFirstColumn="0" w:firstRowLastColumn="0" w:lastRowFirstColumn="0" w:lastRowLastColumn="0"/>
+            <w:tcW w:w="2257" w:type="dxa"/>
+            <w:vAlign w:val="center"/>
+          </w:tcPr>
+          <w:p>
+            <w:pPr>
+              <w:jc w:val="center"/>
+              <w:rPr>
+                <w:rFonts w:ascii="Times New Roman" w:hAnsi="Times New Roman" w:cs="Times New Roman"/>
+              </w:rPr>
+            </w:pPr>
+            <w:r>
+              <w:rPr>
+                <w:rFonts w:ascii="Times New Roman" w:hAnsi="Times New Roman" w:cs="Times New Roman"/>
+              </w:rPr>
+              <w:t>KNN Regreesion</w:t>
+            </w:r>
+          </w:p>
+        </w:tc>
+        <w:tc>
+          <w:tcPr>
+            <w:tcW w:w="1297" w:type="dxa"/>
+            <w:vAlign w:val="center"/>
+          </w:tcPr>
+          <w:p>
+            <w:pPr>
+              <w:jc w:val="center"/>
+              <w:cnfStyle w:val="000000100000" w:firstRow="0" w:lastRow="0" w:firstColumn="0" w:lastColumn="0" w:oddVBand="0" w:evenVBand="0" w:oddHBand="1" w:evenHBand="0" w:firstRowFirstColumn="0" w:firstRowLastColumn="0" w:lastRowFirstColumn="0" w:lastRowLastColumn="0"/>
+              <w:rPr>
+                <w:rFonts w:ascii="Times New Roman" w:hAnsi="Times New Roman" w:cs="Times New Roman"/>
+              </w:rPr>
+            </w:pPr>
+            <w:r>
+              <w:rPr>
+                <w:rFonts w:ascii="Times New Roman" w:hAnsi="Times New Roman" w:cs="Times New Roman"/>
+              </w:rPr>
+              <w:t>Regression</w:t>
+            </w:r>
+          </w:p>
+        </w:tc>
+        <w:tc>
+          <w:tcPr>
+            <w:tcW w:w="1328" w:type="dxa"/>
+            <w:vAlign w:val="center"/>
+          </w:tcPr>
+          <w:p>
+            <w:pPr>
+              <w:jc w:val="center"/>
+              <w:cnfStyle w:val="000000100000" w:firstRow="0" w:lastRow="0" w:firstColumn="0" w:lastColumn="0" w:oddVBand="0" w:evenVBand="0" w:oddHBand="1" w:evenHBand="0" w:firstRowFirstColumn="0" w:firstRowLastColumn="0" w:lastRowFirstColumn="0" w:lastRowLastColumn="0"/>
+              <w:rPr>
+                <w:rFonts w:ascii="Times New Roman" w:hAnsi="Times New Roman" w:cs="Times New Roman"/>
+              </w:rPr>
+            </w:pPr>
+            <w:r>
+              <w:rPr>
+                <w:rFonts w:ascii="Times New Roman" w:hAnsi="Times New Roman" w:cs="Times New Roman"/>
+              </w:rPr>
+              <w:t>Phi tuyến</w:t>
+            </w:r>
+          </w:p>
+        </w:tc>
+        <w:tc>
+          <w:tcPr>
+            <w:tcW w:w="1939" w:type="dxa"/>
+            <w:vAlign w:val="center"/>
+          </w:tcPr>
+          <w:p>
+            <w:pPr>
+              <w:jc w:val="center"/>
+              <w:cnfStyle w:val="000000100000" w:firstRow="0" w:lastRow="0" w:firstColumn="0" w:lastColumn="0" w:oddVBand="0" w:evenVBand="0" w:oddHBand="1" w:evenHBand="0" w:firstRowFirstColumn="0" w:firstRowLastColumn="0" w:lastRowFirstColumn="0" w:lastRowLastColumn="0"/>
+              <w:rPr>
+                <w:rFonts w:ascii="Times New Roman" w:hAnsi="Times New Roman" w:cs="Times New Roman"/>
+              </w:rPr>
+            </w:pPr>
+            <w:r>
+              <w:rPr>
+                <w:rFonts w:ascii="Times New Roman" w:hAnsi="Times New Roman" w:cs="Times New Roman"/>
+              </w:rPr>
+              <w:t>Trung bình giá trị k láng giềng</w:t>
+            </w:r>
+          </w:p>
+        </w:tc>
+        <w:tc>
+          <w:tcPr>
+            <w:tcW w:w="1374" w:type="dxa"/>
+            <w:vAlign w:val="center"/>
+          </w:tcPr>
+          <w:p>
+            <w:pPr>
+              <w:jc w:val="center"/>
+              <w:cnfStyle w:val="000000100000" w:firstRow="0" w:lastRow="0" w:firstColumn="0" w:lastColumn="0" w:oddVBand="0" w:evenVBand="0" w:oddHBand="1" w:evenHBand="0" w:firstRowFirstColumn="0" w:firstRowLastColumn="0" w:lastRowFirstColumn="0" w:lastRowLastColumn="0"/>
+              <w:rPr>
+                <w:rFonts w:ascii="Times New Roman" w:hAnsi="Times New Roman" w:cs="Times New Roman"/>
+              </w:rPr>
+            </w:pPr>
+            <w:r>
+              <w:rPr>
+                <w:rFonts w:ascii="Times New Roman" w:hAnsi="Times New Roman" w:cs="Times New Roman"/>
+              </w:rPr>
+              <w:t>Dễ cài đặt</w:t>
+            </w:r>
+          </w:p>
+        </w:tc>
+        <w:tc>
+          <w:tcPr>
+            <w:tcW w:w="1450" w:type="dxa"/>
+            <w:vAlign w:val="center"/>
+          </w:tcPr>
+          <w:p>
+            <w:pPr>
+              <w:jc w:val="center"/>
+              <w:cnfStyle w:val="000000100000" w:firstRow="0" w:lastRow="0" w:firstColumn="0" w:lastColumn="0" w:oddVBand="0" w:evenVBand="0" w:oddHBand="1" w:evenHBand="0" w:firstRowFirstColumn="0" w:firstRowLastColumn="0" w:lastRowFirstColumn="0" w:lastRowLastColumn="0"/>
+              <w:rPr>
+                <w:rFonts w:ascii="Times New Roman" w:hAnsi="Times New Roman" w:cs="Times New Roman"/>
+              </w:rPr>
+            </w:pPr>
+            <w:r>
+              <w:rPr>
+                <w:rFonts w:ascii="Times New Roman" w:hAnsi="Times New Roman" w:cs="Times New Roman"/>
+              </w:rPr>
+              <w:t>Tương tự KNN Classifier</w:t>
+            </w:r>
+          </w:p>
+        </w:tc>
+        <w:tc>
+          <w:tcPr>
+            <w:tcW w:w="2108" w:type="dxa"/>
+            <w:vAlign w:val="center"/>
+          </w:tcPr>
+          <w:p>
+            <w:pPr>
+              <w:jc w:val="center"/>
+              <w:cnfStyle w:val="000000100000" w:firstRow="0" w:lastRow="0" w:firstColumn="0" w:lastColumn="0" w:oddVBand="0" w:evenVBand="0" w:oddHBand="1" w:evenHBand="0" w:firstRowFirstColumn="0" w:firstRowLastColumn="0" w:lastRowFirstColumn="0" w:lastRowLastColumn="0"/>
+              <w:rPr>
+                <w:rFonts w:ascii="Times New Roman" w:hAnsi="Times New Roman" w:cs="Times New Roman"/>
+              </w:rPr>
+            </w:pPr>
+            <w:r>
+              <w:rPr>
+                <w:rFonts w:ascii="Times New Roman" w:hAnsi="Times New Roman" w:cs="Times New Roman"/>
+              </w:rPr>
+              <w:t>Dự đoán giá, dự đoán rating</w:t>
+            </w:r>
+          </w:p>
+        </w:tc>
+      </w:tr>
+      <w:tr>
+        <w:trPr>
+          <w:jc w:val="center"/>
+        </w:trPr>
+        <w:tc>
+          <w:tcPr>
+            <w:cnfStyle w:val="001000000000" w:firstRow="0" w:lastRow="0" w:firstColumn="1" w:lastColumn="0" w:oddVBand="0" w:evenVBand="0" w:oddHBand="0" w:evenHBand="0" w:firstRowFirstColumn="0" w:firstRowLastColumn="0" w:lastRowFirstColumn="0" w:lastRowLastColumn="0"/>
+            <w:tcW w:w="2257" w:type="dxa"/>
+            <w:vAlign w:val="center"/>
+          </w:tcPr>
+          <w:p>
+            <w:pPr>
+              <w:jc w:val="center"/>
+              <w:rPr>
+                <w:rFonts w:ascii="Times New Roman" w:hAnsi="Times New Roman" w:cs="Times New Roman"/>
+                <w:b w:val="0"/>
+                <w:bCs w:val="0"/>
+              </w:rPr>
+            </w:pPr>
+            <w:r>
+              <w:rPr>
+                <w:rFonts w:ascii="Times New Roman" w:hAnsi="Times New Roman" w:cs="Times New Roman"/>
+              </w:rPr>
+              <w:t>Gaussian NB</w:t>
+            </w:r>
+          </w:p>
+        </w:tc>
+        <w:tc>
+          <w:tcPr>
+            <w:tcW w:w="1297" w:type="dxa"/>
+            <w:vAlign w:val="center"/>
+          </w:tcPr>
+          <w:p>
+            <w:pPr>
+              <w:jc w:val="center"/>
+              <w:cnfStyle w:val="000000000000" w:firstRow="0" w:lastRow="0" w:firstColumn="0" w:lastColumn="0" w:oddVBand="0" w:evenVBand="0" w:oddHBand="0" w:evenHBand="0" w:firstRowFirstColumn="0" w:firstRowLastColumn="0" w:lastRowFirstColumn="0" w:lastRowLastColumn="0"/>
+              <w:rPr>
+                <w:rFonts w:ascii="Times New Roman" w:hAnsi="Times New Roman" w:cs="Times New Roman"/>
+              </w:rPr>
+            </w:pPr>
+            <w:r>
+              <w:rPr>
+                <w:rFonts w:ascii="Times New Roman" w:hAnsi="Times New Roman" w:cs="Times New Roman"/>
+              </w:rPr>
+              <w:t>Class</w:t>
+            </w:r>
+          </w:p>
+        </w:tc>
+        <w:tc>
+          <w:tcPr>
+            <w:tcW w:w="1328" w:type="dxa"/>
+            <w:vAlign w:val="center"/>
+          </w:tcPr>
+          <w:p>
+            <w:pPr>
+              <w:jc w:val="center"/>
+              <w:cnfStyle w:val="000000000000" w:firstRow="0" w:lastRow="0" w:firstColumn="0" w:lastColumn="0" w:oddVBand="0" w:evenVBand="0" w:oddHBand="0" w:evenHBand="0" w:firstRowFirstColumn="0" w:firstRowLastColumn="0" w:lastRowFirstColumn="0" w:lastRowLastColumn="0"/>
+              <w:rPr>
+                <w:rFonts w:ascii="Times New Roman" w:hAnsi="Times New Roman" w:cs="Times New Roman"/>
+              </w:rPr>
+            </w:pPr>
+            <w:r>
+              <w:rPr>
+                <w:rFonts w:ascii="Times New Roman" w:hAnsi="Times New Roman" w:cs="Times New Roman"/>
+              </w:rPr>
+              <w:t>Tuyến tính (giả định phân phối Gaussian)</w:t>
+            </w:r>
+          </w:p>
+        </w:tc>
+        <w:tc>
+          <w:tcPr>
+            <w:tcW w:w="1939" w:type="dxa"/>
+            <w:vAlign w:val="center"/>
+          </w:tcPr>
+          <w:p>
+            <w:pPr>
+              <w:jc w:val="center"/>
+              <w:cnfStyle w:val="000000000000" w:firstRow="0" w:lastRow="0" w:firstColumn="0" w:lastColumn="0" w:oddVBand="0" w:evenVBand="0" w:oddHBand="0" w:evenHBand="0" w:firstRowFirstColumn="0" w:firstRowLastColumn="0" w:lastRowFirstColumn="0" w:lastRowLastColumn="0"/>
+              <w:rPr>
+                <w:rFonts w:ascii="Times New Roman" w:hAnsi="Times New Roman" w:cs="Times New Roman"/>
+              </w:rPr>
+            </w:pPr>
+            <w:r>
+              <w:rPr>
+                <w:rFonts w:ascii="Times New Roman" w:hAnsi="Times New Roman" w:cs="Times New Roman"/>
+              </w:rPr>
+              <w:t>Bayes’ theorem + giả định độc lập</w:t>
+            </w:r>
+          </w:p>
+        </w:tc>
+        <w:tc>
+          <w:tcPr>
+            <w:tcW w:w="1374" w:type="dxa"/>
+            <w:vAlign w:val="center"/>
+          </w:tcPr>
+          <w:p>
+            <w:pPr>
+              <w:jc w:val="center"/>
+              <w:cnfStyle w:val="000000000000" w:firstRow="0" w:lastRow="0" w:firstColumn="0" w:lastColumn="0" w:oddVBand="0" w:evenVBand="0" w:oddHBand="0" w:evenHBand="0" w:firstRowFirstColumn="0" w:firstRowLastColumn="0" w:lastRowFirstColumn="0" w:lastRowLastColumn="0"/>
+              <w:rPr>
+                <w:rFonts w:ascii="Times New Roman" w:hAnsi="Times New Roman" w:cs="Times New Roman"/>
+              </w:rPr>
+            </w:pPr>
+            <w:r>
+              <w:rPr>
+                <w:rFonts w:ascii="Times New Roman" w:hAnsi="Times New Roman" w:cs="Times New Roman"/>
+              </w:rPr>
+              <w:t>Nhanh, hiệu quả với text</w:t>
+            </w:r>
+          </w:p>
+        </w:tc>
+        <w:tc>
+          <w:tcPr>
+            <w:tcW w:w="1450" w:type="dxa"/>
+            <w:vAlign w:val="center"/>
+          </w:tcPr>
+          <w:p>
+            <w:pPr>
+              <w:jc w:val="center"/>
+              <w:cnfStyle w:val="000000000000" w:firstRow="0" w:lastRow="0" w:firstColumn="0" w:lastColumn="0" w:oddVBand="0" w:evenVBand="0" w:oddHBand="0" w:evenHBand="0" w:firstRowFirstColumn="0" w:firstRowLastColumn="0" w:lastRowFirstColumn="0" w:lastRowLastColumn="0"/>
+              <w:rPr>
+                <w:rFonts w:ascii="Times New Roman" w:hAnsi="Times New Roman" w:cs="Times New Roman"/>
+              </w:rPr>
+            </w:pPr>
+            <w:r>
+              <w:rPr>
+                <w:rFonts w:ascii="Times New Roman" w:hAnsi="Times New Roman" w:cs="Times New Roman"/>
+              </w:rPr>
+              <w:t>Giả định độc lập mạnh</w:t>
+            </w:r>
+          </w:p>
+        </w:tc>
+        <w:tc>
+          <w:tcPr>
+            <w:tcW w:w="2108" w:type="dxa"/>
+            <w:vAlign w:val="center"/>
+          </w:tcPr>
+          <w:p>
+            <w:pPr>
+              <w:jc w:val="center"/>
+              <w:cnfStyle w:val="000000000000" w:firstRow="0" w:lastRow="0" w:firstColumn="0" w:lastColumn="0" w:oddVBand="0" w:evenVBand="0" w:oddHBand="0" w:evenHBand="0" w:firstRowFirstColumn="0" w:firstRowLastColumn="0" w:lastRowFirstColumn="0" w:lastRowLastColumn="0"/>
+              <w:rPr>
+                <w:rFonts w:ascii="Times New Roman" w:hAnsi="Times New Roman" w:cs="Times New Roman"/>
+              </w:rPr>
+            </w:pPr>
+            <w:r>
+              <w:rPr>
+                <w:rFonts w:ascii="Times New Roman" w:hAnsi="Times New Roman" w:cs="Times New Roman"/>
+              </w:rPr>
+              <w:t>Phân loại spam, text</w:t>
+            </w:r>
+          </w:p>
+        </w:tc>
+      </w:tr>
+      <w:tr>
+        <w:trPr>
+          <w:cnfStyle w:val="000000100000" w:firstRow="0" w:lastRow="0" w:firstColumn="0" w:lastColumn="0" w:oddVBand="0" w:evenVBand="0" w:oddHBand="1" w:evenHBand="0" w:firstRowFirstColumn="0" w:firstRowLastColumn="0" w:lastRowFirstColumn="0" w:lastRowLastColumn="0"/>
+          <w:jc w:val="center"/>
+        </w:trPr>
+        <w:tc>
+          <w:tcPr>
+            <w:cnfStyle w:val="001000000000" w:firstRow="0" w:lastRow="0" w:firstColumn="1" w:lastColumn="0" w:oddVBand="0" w:evenVBand="0" w:oddHBand="0" w:evenHBand="0" w:firstRowFirstColumn="0" w:firstRowLastColumn="0" w:lastRowFirstColumn="0" w:lastRowLastColumn="0"/>
+            <w:tcW w:w="2257" w:type="dxa"/>
+            <w:vAlign w:val="center"/>
+          </w:tcPr>
+          <w:p>
+            <w:pPr>
+              <w:jc w:val="center"/>
+              <w:rPr>
+                <w:rFonts w:ascii="Times New Roman" w:hAnsi="Times New Roman" w:cs="Times New Roman"/>
+                <w:b w:val="0"/>
+                <w:bCs w:val="0"/>
+              </w:rPr>
+            </w:pPr>
+            <w:r>
+              <w:rPr>
+                <w:rFonts w:ascii="Times New Roman" w:hAnsi="Times New Roman" w:cs="Times New Roman"/>
+              </w:rPr>
+              <w:t>K-Clustering (K-means)</w:t>
+            </w:r>
+          </w:p>
+        </w:tc>
+        <w:tc>
+          <w:tcPr>
+            <w:tcW w:w="1297" w:type="dxa"/>
+            <w:vAlign w:val="center"/>
+          </w:tcPr>
+          <w:p>
+            <w:pPr>
+              <w:jc w:val="center"/>
+              <w:cnfStyle w:val="000000100000" w:firstRow="0" w:lastRow="0" w:firstColumn="0" w:lastColumn="0" w:oddVBand="0" w:evenVBand="0" w:oddHBand="1" w:evenHBand="0" w:firstRowFirstColumn="0" w:firstRowLastColumn="0" w:lastRowFirstColumn="0" w:lastRowLastColumn="0"/>
+              <w:rPr>
+                <w:rFonts w:ascii="Times New Roman" w:hAnsi="Times New Roman" w:cs="Times New Roman"/>
+              </w:rPr>
+            </w:pPr>
+            <w:r>
+              <w:rPr>
+                <w:rFonts w:ascii="Times New Roman" w:hAnsi="Times New Roman" w:cs="Times New Roman"/>
+              </w:rPr>
+              <w:t>Cluster (unsupervised)</w:t>
+            </w:r>
+          </w:p>
+        </w:tc>
+        <w:tc>
+          <w:tcPr>
+            <w:tcW w:w="1328" w:type="dxa"/>
+            <w:vAlign w:val="center"/>
+          </w:tcPr>
+          <w:p>
+            <w:pPr>
+              <w:jc w:val="center"/>
+              <w:cnfStyle w:val="000000100000" w:firstRow="0" w:lastRow="0" w:firstColumn="0" w:lastColumn="0" w:oddVBand="0" w:evenVBand="0" w:oddHBand="1" w:evenHBand="0" w:firstRowFirstColumn="0" w:firstRowLastColumn="0" w:lastRowFirstColumn="0" w:lastRowLastColumn="0"/>
+              <w:rPr>
+                <w:rFonts w:ascii="Times New Roman" w:hAnsi="Times New Roman" w:cs="Times New Roman"/>
+              </w:rPr>
+            </w:pPr>
+            <w:r>
+              <w:rPr>
+                <w:rFonts w:ascii="Times New Roman" w:hAnsi="Times New Roman" w:cs="Times New Roman"/>
+              </w:rPr>
+              <w:t>Phi tuyến</w:t>
+            </w:r>
+          </w:p>
+        </w:tc>
+        <w:tc>
+          <w:tcPr>
+            <w:tcW w:w="1939" w:type="dxa"/>
+            <w:vAlign w:val="center"/>
+          </w:tcPr>
+          <w:p>
+            <w:pPr>
+              <w:jc w:val="center"/>
+              <w:cnfStyle w:val="000000100000" w:firstRow="0" w:lastRow="0" w:firstColumn="0" w:lastColumn="0" w:oddVBand="0" w:evenVBand="0" w:oddHBand="1" w:evenHBand="0" w:firstRowFirstColumn="0" w:firstRowLastColumn="0" w:lastRowFirstColumn="0" w:lastRowLastColumn="0"/>
+              <w:rPr>
+                <w:rFonts w:ascii="Times New Roman" w:hAnsi="Times New Roman" w:cs="Times New Roman"/>
+              </w:rPr>
+            </w:pPr>
+            <w:r>
+              <w:rPr>
+                <w:rFonts w:ascii="Times New Roman" w:hAnsi="Times New Roman" w:cs="Times New Roman"/>
+              </w:rPr>
+              <w:t>Gán điểm vào centroid gần nhất</w:t>
+            </w:r>
+          </w:p>
+        </w:tc>
+        <w:tc>
+          <w:tcPr>
+            <w:tcW w:w="1374" w:type="dxa"/>
+            <w:vAlign w:val="center"/>
+          </w:tcPr>
+          <w:p>
+            <w:pPr>
+              <w:jc w:val="center"/>
+              <w:cnfStyle w:val="000000100000" w:firstRow="0" w:lastRow="0" w:firstColumn="0" w:lastColumn="0" w:oddVBand="0" w:evenVBand="0" w:oddHBand="1" w:evenHBand="0" w:firstRowFirstColumn="0" w:firstRowLastColumn="0" w:lastRowFirstColumn="0" w:lastRowLastColumn="0"/>
+              <w:rPr>
+                <w:rFonts w:ascii="Times New Roman" w:hAnsi="Times New Roman" w:cs="Times New Roman"/>
+              </w:rPr>
+            </w:pPr>
+            <w:r>
+              <w:rPr>
+                <w:rFonts w:ascii="Times New Roman" w:hAnsi="Times New Roman" w:cs="Times New Roman"/>
+              </w:rPr>
+              <w:t>Đơn giản, nhanh</w:t>
+            </w:r>
+          </w:p>
+        </w:tc>
+        <w:tc>
+          <w:tcPr>
+            <w:tcW w:w="1450" w:type="dxa"/>
+            <w:vAlign w:val="center"/>
+          </w:tcPr>
+          <w:p>
+            <w:pPr>
+              <w:jc w:val="center"/>
+              <w:cnfStyle w:val="000000100000" w:firstRow="0" w:lastRow="0" w:firstColumn="0" w:lastColumn="0" w:oddVBand="0" w:evenVBand="0" w:oddHBand="1" w:evenHBand="0" w:firstRowFirstColumn="0" w:firstRowLastColumn="0" w:lastRowFirstColumn="0" w:lastRowLastColumn="0"/>
+              <w:rPr>
+                <w:rFonts w:ascii="Times New Roman" w:hAnsi="Times New Roman" w:cs="Times New Roman"/>
+              </w:rPr>
+            </w:pPr>
+            <w:r>
+              <w:rPr>
+                <w:rFonts w:ascii="Times New Roman" w:hAnsi="Times New Roman" w:cs="Times New Roman"/>
+              </w:rPr>
+              <w:t>Cần chọn K, chạy outlier</w:t>
+            </w:r>
+          </w:p>
+        </w:tc>
+        <w:tc>
+          <w:tcPr>
+            <w:tcW w:w="2108" w:type="dxa"/>
+            <w:vAlign w:val="center"/>
+          </w:tcPr>
+          <w:p>
+            <w:pPr>
+              <w:jc w:val="center"/>
+              <w:cnfStyle w:val="000000100000" w:firstRow="0" w:lastRow="0" w:firstColumn="0" w:lastColumn="0" w:oddVBand="0" w:evenVBand="0" w:oddHBand="1" w:evenHBand="0" w:firstRowFirstColumn="0" w:firstRowLastColumn="0" w:lastRowFirstColumn="0" w:lastRowLastColumn="0"/>
+              <w:rPr>
+                <w:rFonts w:ascii="Times New Roman" w:hAnsi="Times New Roman" w:cs="Times New Roman"/>
+              </w:rPr>
+            </w:pPr>
+            <w:r>
+              <w:rPr>
+                <w:rFonts w:ascii="Times New Roman" w:hAnsi="Times New Roman" w:cs="Times New Roman"/>
+              </w:rPr>
+              <w:t>Phân khúc khách hàng</w:t>
             </w:r>
           </w:p>
         </w:tc>
@@ -1502,6 +2570,672 @@
     </w:p>
     <w:p>
       <w:pPr>
+        <w:pStyle w:val="ListParagraph"/>
+        <w:numPr>
+          <w:ilvl w:val="0"/>
+          <w:numId w:val="3"/>
+        </w:numPr>
+        <w:jc w:val="both"/>
+        <w:rPr>
+          <w:rFonts w:ascii="Times New Roman" w:hAnsi="Times New Roman" w:cs="Times New Roman"/>
+          <w:b/>
+          <w:bCs/>
+        </w:rPr>
+      </w:pPr>
+      <w:r>
+        <w:rPr>
+          <w:rFonts w:ascii="Times New Roman" w:hAnsi="Times New Roman" w:cs="Times New Roman"/>
+          <w:b/>
+          <w:bCs/>
+          <w:i/>
+          <w:iCs/>
+        </w:rPr>
+        <w:t>L1 penalty:</w:t>
+      </w:r>
+      <w:r>
+        <w:rPr>
+          <w:rFonts w:ascii="Times New Roman" w:hAnsi="Times New Roman" w:cs="Times New Roman"/>
+          <w:b/>
+          <w:bCs/>
+        </w:rPr>
+        <w:t xml:space="preserve"> </w:t>
+      </w:r>
+      <w:r>
+        <w:rPr>
+          <w:rFonts w:ascii="Times New Roman" w:hAnsi="Times New Roman" w:cs="Times New Roman"/>
+        </w:rPr>
+        <w:t xml:space="preserve">ép trọng số về 0 </w:t>
+      </w:r>
+      <m:oMath>
+        <m:r>
+          <w:rPr>
+            <w:rFonts w:ascii="Cambria Math" w:hAnsi="Cambria Math" w:cs="Times New Roman"/>
+          </w:rPr>
+          <m:t>→</m:t>
+        </m:r>
+      </m:oMath>
+      <w:r>
+        <w:rPr>
+          <w:rFonts w:ascii="Times New Roman" w:hAnsi="Times New Roman" w:cs="Times New Roman"/>
+        </w:rPr>
+        <w:t xml:space="preserve"> chọn đặc trưng.</w:t>
+      </w:r>
+    </w:p>
+    <w:p>
+      <w:pPr>
+        <w:pStyle w:val="ListParagraph"/>
+        <w:numPr>
+          <w:ilvl w:val="0"/>
+          <w:numId w:val="3"/>
+        </w:numPr>
+        <w:jc w:val="both"/>
+        <w:rPr>
+          <w:rFonts w:ascii="Times New Roman" w:hAnsi="Times New Roman" w:cs="Times New Roman"/>
+          <w:b/>
+          <w:bCs/>
+        </w:rPr>
+      </w:pPr>
+      <w:r>
+        <w:rPr>
+          <w:rFonts w:ascii="Times New Roman" w:hAnsi="Times New Roman" w:cs="Times New Roman"/>
+          <w:b/>
+          <w:bCs/>
+          <w:i/>
+          <w:iCs/>
+        </w:rPr>
+        <w:t>L</w:t>
+      </w:r>
+      <w:r>
+        <w:rPr>
+          <w:rFonts w:ascii="Times New Roman" w:hAnsi="Times New Roman" w:cs="Times New Roman"/>
+          <w:b/>
+          <w:bCs/>
+          <w:i/>
+          <w:iCs/>
+        </w:rPr>
+        <w:t>2</w:t>
+      </w:r>
+      <w:r>
+        <w:rPr>
+          <w:rFonts w:ascii="Times New Roman" w:hAnsi="Times New Roman" w:cs="Times New Roman"/>
+          <w:b/>
+          <w:bCs/>
+          <w:i/>
+          <w:iCs/>
+        </w:rPr>
+        <w:t xml:space="preserve"> penalty:</w:t>
+      </w:r>
+      <w:r>
+        <w:rPr>
+          <w:rFonts w:ascii="Times New Roman" w:hAnsi="Times New Roman" w:cs="Times New Roman"/>
+          <w:b/>
+          <w:bCs/>
+          <w:i/>
+          <w:iCs/>
+        </w:rPr>
+        <w:t xml:space="preserve"> </w:t>
+      </w:r>
+      <w:r>
+        <w:rPr>
+          <w:rFonts w:ascii="Times New Roman" w:hAnsi="Times New Roman" w:cs="Times New Roman"/>
+        </w:rPr>
+        <w:t xml:space="preserve">làm nhỏ trọng số </w:t>
+      </w:r>
+      <m:oMath>
+        <m:r>
+          <w:rPr>
+            <w:rFonts w:ascii="Cambria Math" w:hAnsi="Cambria Math" w:cs="Times New Roman"/>
+          </w:rPr>
+          <m:t>→</m:t>
+        </m:r>
+      </m:oMath>
+      <w:r>
+        <w:rPr>
+          <w:rFonts w:ascii="Times New Roman" w:eastAsiaTheme="minorEastAsia" w:hAnsi="Times New Roman" w:cs="Times New Roman"/>
+        </w:rPr>
+        <w:t xml:space="preserve"> </w:t>
+      </w:r>
+      <w:r>
+        <w:rPr>
+          <w:rFonts w:ascii="Times New Roman" w:hAnsi="Times New Roman" w:cs="Times New Roman"/>
+        </w:rPr>
+        <w:t>ổn định mô hình.</w:t>
+      </w:r>
+    </w:p>
+    <w:p>
+      <w:pPr>
+        <w:pStyle w:val="ListParagraph"/>
+        <w:numPr>
+          <w:ilvl w:val="0"/>
+          <w:numId w:val="3"/>
+        </w:numPr>
+        <w:jc w:val="both"/>
+        <w:rPr>
+          <w:rFonts w:ascii="Times New Roman" w:hAnsi="Times New Roman" w:cs="Times New Roman"/>
+          <w:b/>
+          <w:bCs/>
+        </w:rPr>
+      </w:pPr>
+      <w:r>
+        <w:rPr>
+          <w:rFonts w:ascii="Times New Roman" w:hAnsi="Times New Roman" w:cs="Times New Roman"/>
+          <w:b/>
+          <w:bCs/>
+          <w:i/>
+          <w:iCs/>
+        </w:rPr>
+        <w:t>Overfit:</w:t>
+      </w:r>
+      <w:r>
+        <w:rPr>
+          <w:rFonts w:ascii="Times New Roman" w:hAnsi="Times New Roman" w:cs="Times New Roman"/>
+          <w:b/>
+          <w:bCs/>
+        </w:rPr>
+        <w:t xml:space="preserve"> </w:t>
+      </w:r>
+      <w:r>
+        <w:rPr>
+          <w:rFonts w:ascii="Times New Roman" w:hAnsi="Times New Roman" w:cs="Times New Roman"/>
+        </w:rPr>
+        <w:t>học thuộc train, dự đoán test kém.</w:t>
+      </w:r>
+    </w:p>
+    <w:p>
+      <w:pPr>
+        <w:pStyle w:val="ListParagraph"/>
+        <w:numPr>
+          <w:ilvl w:val="0"/>
+          <w:numId w:val="3"/>
+        </w:numPr>
+        <w:jc w:val="both"/>
+        <w:rPr>
+          <w:rFonts w:ascii="Times New Roman" w:hAnsi="Times New Roman" w:cs="Times New Roman"/>
+          <w:b/>
+          <w:bCs/>
+        </w:rPr>
+      </w:pPr>
+      <w:r>
+        <w:rPr>
+          <w:rFonts w:ascii="Times New Roman" w:hAnsi="Times New Roman" w:cs="Times New Roman"/>
+          <w:b/>
+          <w:bCs/>
+          <w:i/>
+          <w:iCs/>
+        </w:rPr>
+        <w:t>Feature selection: c</w:t>
+      </w:r>
+      <w:r>
+        <w:rPr>
+          <w:rFonts w:ascii="Times New Roman" w:hAnsi="Times New Roman" w:cs="Times New Roman"/>
+        </w:rPr>
+        <w:t>họn đặc trưng quan trọng, bỏ nhiễu.</w:t>
+      </w:r>
+    </w:p>
+    <w:p>
+      <w:pPr>
+        <w:pStyle w:val="ListParagraph"/>
+        <w:numPr>
+          <w:ilvl w:val="0"/>
+          <w:numId w:val="3"/>
+        </w:numPr>
+        <w:jc w:val="both"/>
+        <w:rPr>
+          <w:rFonts w:ascii="Times New Roman" w:hAnsi="Times New Roman" w:cs="Times New Roman"/>
+          <w:b/>
+          <w:bCs/>
+        </w:rPr>
+      </w:pPr>
+      <w:r>
+        <w:rPr>
+          <w:rFonts w:ascii="Times New Roman" w:hAnsi="Times New Roman" w:cs="Times New Roman"/>
+          <w:b/>
+          <w:bCs/>
+          <w:i/>
+          <w:iCs/>
+        </w:rPr>
+        <w:t>Entropy:</w:t>
+      </w:r>
+      <w:r>
+        <w:rPr>
+          <w:rFonts w:ascii="Times New Roman" w:hAnsi="Times New Roman" w:cs="Times New Roman"/>
+          <w:b/>
+          <w:bCs/>
+        </w:rPr>
+        <w:t xml:space="preserve"> </w:t>
+      </w:r>
+      <w:r>
+        <w:rPr>
+          <w:rFonts w:ascii="Times New Roman" w:hAnsi="Times New Roman" w:cs="Times New Roman"/>
+        </w:rPr>
+        <w:t>độ hỗn loạn khi chia dữ liệu.</w:t>
+      </w:r>
+    </w:p>
+    <w:p>
+      <w:pPr>
+        <w:pStyle w:val="ListParagraph"/>
+        <w:numPr>
+          <w:ilvl w:val="0"/>
+          <w:numId w:val="3"/>
+        </w:numPr>
+        <w:jc w:val="both"/>
+        <w:rPr>
+          <w:rFonts w:ascii="Times New Roman" w:hAnsi="Times New Roman" w:cs="Times New Roman"/>
+          <w:b/>
+          <w:bCs/>
+        </w:rPr>
+      </w:pPr>
+      <w:r>
+        <w:rPr>
+          <w:rFonts w:ascii="Times New Roman" w:hAnsi="Times New Roman" w:cs="Times New Roman"/>
+          <w:b/>
+          <w:bCs/>
+          <w:i/>
+          <w:iCs/>
+        </w:rPr>
+        <w:t>Gini:</w:t>
+      </w:r>
+      <w:r>
+        <w:rPr>
+          <w:rFonts w:ascii="Times New Roman" w:hAnsi="Times New Roman" w:cs="Times New Roman"/>
+          <w:b/>
+          <w:bCs/>
+        </w:rPr>
+        <w:t xml:space="preserve"> </w:t>
+      </w:r>
+      <w:r>
+        <w:rPr>
+          <w:rFonts w:ascii="Times New Roman" w:hAnsi="Times New Roman" w:cs="Times New Roman"/>
+        </w:rPr>
+        <w:t>xác suất gán sai lớp khi chia</w:t>
+      </w:r>
+      <w:r>
+        <w:rPr>
+          <w:rFonts w:ascii="Times New Roman" w:hAnsi="Times New Roman" w:cs="Times New Roman"/>
+        </w:rPr>
+        <w:t>.</w:t>
+      </w:r>
+    </w:p>
+    <w:p>
+      <w:pPr>
+        <w:pStyle w:val="ListParagraph"/>
+        <w:numPr>
+          <w:ilvl w:val="0"/>
+          <w:numId w:val="3"/>
+        </w:numPr>
+        <w:jc w:val="both"/>
+        <w:rPr>
+          <w:rFonts w:ascii="Times New Roman" w:hAnsi="Times New Roman" w:cs="Times New Roman"/>
+          <w:b/>
+          <w:bCs/>
+        </w:rPr>
+      </w:pPr>
+      <w:r>
+        <w:rPr>
+          <w:rFonts w:ascii="Times New Roman" w:hAnsi="Times New Roman" w:cs="Times New Roman"/>
+          <w:b/>
+          <w:bCs/>
+          <w:i/>
+          <w:iCs/>
+        </w:rPr>
+        <w:lastRenderedPageBreak/>
+        <w:t>Bagging:</w:t>
+      </w:r>
+      <w:r>
+        <w:rPr>
+          <w:rFonts w:ascii="Times New Roman" w:hAnsi="Times New Roman" w:cs="Times New Roman"/>
+          <w:b/>
+          <w:bCs/>
+        </w:rPr>
+        <w:t xml:space="preserve"> </w:t>
+      </w:r>
+      <w:r>
+        <w:rPr>
+          <w:rFonts w:ascii="Times New Roman" w:hAnsi="Times New Roman" w:cs="Times New Roman"/>
+        </w:rPr>
+        <w:t xml:space="preserve">nhiều mô hình song song </w:t>
+      </w:r>
+      <m:oMath>
+        <m:r>
+          <w:rPr>
+            <w:rFonts w:ascii="Cambria Math" w:hAnsi="Cambria Math" w:cs="Times New Roman"/>
+          </w:rPr>
+          <m:t>→</m:t>
+        </m:r>
+      </m:oMath>
+      <w:r>
+        <w:rPr>
+          <w:rFonts w:ascii="Times New Roman" w:hAnsi="Times New Roman" w:cs="Times New Roman"/>
+        </w:rPr>
+        <w:t xml:space="preserve"> vote/average.</w:t>
+      </w:r>
+    </w:p>
+    <w:p>
+      <w:pPr>
+        <w:pStyle w:val="ListParagraph"/>
+        <w:numPr>
+          <w:ilvl w:val="0"/>
+          <w:numId w:val="3"/>
+        </w:numPr>
+        <w:jc w:val="both"/>
+        <w:rPr>
+          <w:rFonts w:ascii="Times New Roman" w:hAnsi="Times New Roman" w:cs="Times New Roman"/>
+          <w:b/>
+          <w:bCs/>
+        </w:rPr>
+      </w:pPr>
+      <w:r>
+        <w:rPr>
+          <w:rFonts w:ascii="Times New Roman" w:hAnsi="Times New Roman" w:cs="Times New Roman"/>
+          <w:b/>
+          <w:bCs/>
+          <w:i/>
+          <w:iCs/>
+        </w:rPr>
+        <w:t>Boosting:</w:t>
+      </w:r>
+      <w:r>
+        <w:rPr>
+          <w:rFonts w:ascii="Times New Roman" w:hAnsi="Times New Roman" w:cs="Times New Roman"/>
+          <w:b/>
+          <w:bCs/>
+        </w:rPr>
+        <w:t xml:space="preserve"> </w:t>
+      </w:r>
+      <w:r>
+        <w:rPr>
+          <w:rFonts w:ascii="Times New Roman" w:hAnsi="Times New Roman" w:cs="Times New Roman"/>
+        </w:rPr>
+        <w:t xml:space="preserve">nhiều mô hình nối tiếp </w:t>
+      </w:r>
+      <m:oMath>
+        <m:r>
+          <w:rPr>
+            <w:rFonts w:ascii="Cambria Math" w:hAnsi="Cambria Math" w:cs="Times New Roman"/>
+          </w:rPr>
+          <m:t>→</m:t>
+        </m:r>
+      </m:oMath>
+      <w:r>
+        <w:rPr>
+          <w:rFonts w:ascii="Times New Roman" w:hAnsi="Times New Roman" w:cs="Times New Roman"/>
+        </w:rPr>
+        <w:t xml:space="preserve"> sửa sai dần</w:t>
+      </w:r>
+      <w:r>
+        <w:rPr>
+          <w:rFonts w:ascii="Times New Roman" w:hAnsi="Times New Roman" w:cs="Times New Roman"/>
+        </w:rPr>
+        <w:t>.</w:t>
+      </w:r>
+    </w:p>
+    <w:p>
+      <w:pPr>
+        <w:pStyle w:val="ListParagraph"/>
+        <w:numPr>
+          <w:ilvl w:val="0"/>
+          <w:numId w:val="3"/>
+        </w:numPr>
+        <w:jc w:val="both"/>
+        <w:rPr>
+          <w:rFonts w:ascii="Times New Roman" w:hAnsi="Times New Roman" w:cs="Times New Roman"/>
+          <w:b/>
+          <w:bCs/>
+        </w:rPr>
+      </w:pPr>
+      <w:r>
+        <w:rPr>
+          <w:rFonts w:ascii="Times New Roman" w:hAnsi="Times New Roman" w:cs="Times New Roman"/>
+          <w:b/>
+          <w:bCs/>
+          <w:i/>
+          <w:iCs/>
+        </w:rPr>
+        <w:t>Tuning:</w:t>
+      </w:r>
+      <w:r>
+        <w:rPr>
+          <w:rFonts w:ascii="Times New Roman" w:hAnsi="Times New Roman" w:cs="Times New Roman"/>
+          <w:b/>
+          <w:bCs/>
+        </w:rPr>
+        <w:t xml:space="preserve"> </w:t>
+      </w:r>
+      <w:r>
+        <w:rPr>
+          <w:rFonts w:ascii="Times New Roman" w:hAnsi="Times New Roman" w:cs="Times New Roman"/>
+        </w:rPr>
+        <w:t>chỉnh hyperparameter để tối ưu.</w:t>
+      </w:r>
+    </w:p>
+    <w:p>
+      <w:pPr>
+        <w:pStyle w:val="ListParagraph"/>
+        <w:numPr>
+          <w:ilvl w:val="0"/>
+          <w:numId w:val="3"/>
+        </w:numPr>
+        <w:jc w:val="both"/>
+        <w:rPr>
+          <w:rFonts w:ascii="Times New Roman" w:hAnsi="Times New Roman" w:cs="Times New Roman"/>
+          <w:b/>
+          <w:bCs/>
+        </w:rPr>
+      </w:pPr>
+      <w:r>
+        <w:rPr>
+          <w:rFonts w:ascii="Times New Roman" w:hAnsi="Times New Roman" w:cs="Times New Roman"/>
+          <w:b/>
+          <w:bCs/>
+          <w:i/>
+          <w:iCs/>
+        </w:rPr>
+        <w:t>Max-margin:</w:t>
+      </w:r>
+      <w:r>
+        <w:rPr>
+          <w:rFonts w:ascii="Times New Roman" w:hAnsi="Times New Roman" w:cs="Times New Roman"/>
+          <w:b/>
+          <w:bCs/>
+        </w:rPr>
+        <w:t xml:space="preserve"> </w:t>
+      </w:r>
+      <w:r>
+        <w:rPr>
+          <w:rFonts w:ascii="Times New Roman" w:hAnsi="Times New Roman" w:cs="Times New Roman"/>
+        </w:rPr>
+        <w:t>tách 2 lớp xa nhất (SVM).</w:t>
+      </w:r>
+    </w:p>
+    <w:p>
+      <w:pPr>
+        <w:pStyle w:val="ListParagraph"/>
+        <w:numPr>
+          <w:ilvl w:val="0"/>
+          <w:numId w:val="3"/>
+        </w:numPr>
+        <w:jc w:val="both"/>
+        <w:rPr>
+          <w:rFonts w:ascii="Times New Roman" w:hAnsi="Times New Roman" w:cs="Times New Roman"/>
+          <w:b/>
+          <w:bCs/>
+        </w:rPr>
+      </w:pPr>
+      <w:r>
+        <w:rPr>
+          <w:rFonts w:ascii="Times New Roman" w:hAnsi="Times New Roman" w:cs="Times New Roman"/>
+          <w:b/>
+          <w:bCs/>
+          <w:i/>
+          <w:iCs/>
+        </w:rPr>
+        <w:t>Kernel trick:</w:t>
+      </w:r>
+      <w:r>
+        <w:rPr>
+          <w:rFonts w:ascii="Times New Roman" w:hAnsi="Times New Roman" w:cs="Times New Roman"/>
+          <w:b/>
+          <w:bCs/>
+        </w:rPr>
+        <w:t xml:space="preserve"> </w:t>
+      </w:r>
+      <w:r>
+        <w:rPr>
+          <w:rFonts w:ascii="Times New Roman" w:hAnsi="Times New Roman" w:cs="Times New Roman"/>
+        </w:rPr>
+        <w:t>biến đổi không gian để phân tách tuyến tính.</w:t>
+      </w:r>
+    </w:p>
+    <w:p>
+      <w:pPr>
+        <w:pStyle w:val="ListParagraph"/>
+        <w:numPr>
+          <w:ilvl w:val="0"/>
+          <w:numId w:val="3"/>
+        </w:numPr>
+        <w:jc w:val="both"/>
+        <w:rPr>
+          <w:rFonts w:ascii="Times New Roman" w:hAnsi="Times New Roman" w:cs="Times New Roman"/>
+          <w:b/>
+          <w:bCs/>
+        </w:rPr>
+      </w:pPr>
+      <w:r>
+        <w:rPr>
+          <w:rFonts w:ascii="Times New Roman" w:hAnsi="Times New Roman" w:cs="Times New Roman"/>
+          <w:b/>
+          <w:bCs/>
+          <w:i/>
+          <w:iCs/>
+        </w:rPr>
+        <w:t xml:space="preserve">Curse of dimensionality: </w:t>
+      </w:r>
+      <w:r>
+        <w:rPr>
+          <w:rFonts w:ascii="Times New Roman" w:hAnsi="Times New Roman" w:cs="Times New Roman"/>
+        </w:rPr>
+        <w:t>càng nhiều chiều, dữ liệu càng loãng.</w:t>
+      </w:r>
+    </w:p>
+    <w:p>
+      <w:pPr>
+        <w:pStyle w:val="ListParagraph"/>
+        <w:numPr>
+          <w:ilvl w:val="0"/>
+          <w:numId w:val="3"/>
+        </w:numPr>
+        <w:jc w:val="both"/>
+        <w:rPr>
+          <w:rFonts w:ascii="Times New Roman" w:hAnsi="Times New Roman" w:cs="Times New Roman"/>
+          <w:b/>
+          <w:bCs/>
+        </w:rPr>
+      </w:pPr>
+      <w:r>
+        <w:rPr>
+          <w:rFonts w:ascii="Times New Roman" w:hAnsi="Times New Roman" w:cs="Times New Roman"/>
+          <w:b/>
+          <w:bCs/>
+          <w:i/>
+          <w:iCs/>
+        </w:rPr>
+        <w:t>Bayes’ theorem:</w:t>
+      </w:r>
+      <w:r>
+        <w:rPr>
+          <w:rFonts w:ascii="Times New Roman" w:hAnsi="Times New Roman" w:cs="Times New Roman"/>
+          <w:b/>
+          <w:bCs/>
+        </w:rPr>
+        <w:t xml:space="preserve"> </w:t>
+      </w:r>
+      <w:r>
+        <w:rPr>
+          <w:rFonts w:ascii="Times New Roman" w:hAnsi="Times New Roman" w:cs="Times New Roman"/>
+        </w:rPr>
+        <w:t>xác suất đảo ngược có điều kiện.</w:t>
+      </w:r>
+    </w:p>
+    <w:p>
+      <w:pPr>
+        <w:pStyle w:val="ListParagraph"/>
+        <w:numPr>
+          <w:ilvl w:val="0"/>
+          <w:numId w:val="3"/>
+        </w:numPr>
+        <w:jc w:val="both"/>
+        <w:rPr>
+          <w:rFonts w:ascii="Times New Roman" w:hAnsi="Times New Roman" w:cs="Times New Roman"/>
+          <w:b/>
+          <w:bCs/>
+        </w:rPr>
+      </w:pPr>
+      <w:r>
+        <w:rPr>
+          <w:rFonts w:ascii="Times New Roman" w:hAnsi="Times New Roman" w:cs="Times New Roman"/>
+          <w:b/>
+          <w:bCs/>
+          <w:i/>
+          <w:iCs/>
+        </w:rPr>
+        <w:t>Naïve Bayes:</w:t>
+      </w:r>
+      <w:r>
+        <w:rPr>
+          <w:rFonts w:ascii="Times New Roman" w:hAnsi="Times New Roman" w:cs="Times New Roman"/>
+          <w:b/>
+          <w:bCs/>
+        </w:rPr>
+        <w:t xml:space="preserve"> </w:t>
+      </w:r>
+      <w:r>
+        <w:rPr>
+          <w:rFonts w:ascii="Times New Roman" w:hAnsi="Times New Roman" w:cs="Times New Roman"/>
+        </w:rPr>
+        <w:t>giả định đặc trưng độc lập.</w:t>
+      </w:r>
+    </w:p>
+    <w:p>
+      <w:pPr>
+        <w:pStyle w:val="ListParagraph"/>
+        <w:numPr>
+          <w:ilvl w:val="0"/>
+          <w:numId w:val="3"/>
+        </w:numPr>
+        <w:jc w:val="both"/>
+        <w:rPr>
+          <w:rFonts w:ascii="Times New Roman" w:hAnsi="Times New Roman" w:cs="Times New Roman"/>
+          <w:b/>
+          <w:bCs/>
+        </w:rPr>
+      </w:pPr>
+      <w:r>
+        <w:rPr>
+          <w:rFonts w:ascii="Times New Roman" w:hAnsi="Times New Roman" w:cs="Times New Roman"/>
+          <w:b/>
+          <w:bCs/>
+          <w:i/>
+          <w:iCs/>
+        </w:rPr>
+        <w:t>Outlier:</w:t>
+      </w:r>
+      <w:r>
+        <w:rPr>
+          <w:rFonts w:ascii="Times New Roman" w:hAnsi="Times New Roman" w:cs="Times New Roman"/>
+          <w:b/>
+          <w:bCs/>
+        </w:rPr>
+        <w:t xml:space="preserve"> </w:t>
+      </w:r>
+      <w:r>
+        <w:rPr>
+          <w:rFonts w:ascii="Times New Roman" w:hAnsi="Times New Roman" w:cs="Times New Roman"/>
+        </w:rPr>
+        <w:t>điểm bất thường, khác hẳn số đông.</w:t>
+      </w:r>
+    </w:p>
+    <w:p>
+      <w:pPr>
         <w:jc w:val="both"/>
         <w:rPr>
           <w:rFonts w:ascii="Times New Roman" w:hAnsi="Times New Roman" w:cs="Times New Roman"/>
@@ -1512,7 +3246,7 @@
     </w:p>
     <w:sectPr>
       <w:pgSz w:w="12240" w:h="15840"/>
-      <w:pgMar w:top="720" w:right="720" w:bottom="720" w:left="720" w:header="720" w:footer="720" w:gutter="0"/>
+      <w:pgMar w:top="288" w:right="302" w:bottom="288" w:left="288" w:header="720" w:footer="720" w:gutter="0"/>
       <w:cols w:space="720"/>
       <w:docGrid w:linePitch="360"/>
     </w:sectPr>

</xml_diff>